<commit_message>
final draft ch 3!!!!!
</commit_message>
<xml_diff>
--- a/writings/calado_proposal.docx
+++ b/writings/calado_proposal.docx
@@ -51,7 +51,45 @@
         <w:t xml:space="preserve">interrogate </w:t>
       </w:r>
       <w:r>
-        <w:t xml:space="preserve">computational processes that flatten the complexity of language data. It shows how certain computational tasks, like text analysis, constrain the expressive potential of language forms, stripping them of idiosyncrasies and ambiguities, to turn them into computable units of data. Fields like Queer Studies, Black Feminist Studies, and Trans Studies inspire methodologies for working against these constraints—methodologies that destabilize authoritative and delimiting structures </w:t>
+        <w:t xml:space="preserve">computational processes that flatten the complexity of language data. It shows how certain computational tasks, </w:t>
+      </w:r>
+      <w:r>
+        <w:t xml:space="preserve">like language </w:t>
+      </w:r>
+      <w:proofErr w:type="spellStart"/>
+      <w:r>
+        <w:t>modeling</w:t>
+      </w:r>
+      <w:proofErr w:type="spellEnd"/>
+      <w:r>
+        <w:t>, for example</w:t>
+      </w:r>
+      <w:r>
+        <w:t xml:space="preserve">, constrain the expressive potential of </w:t>
+      </w:r>
+      <w:r>
+        <w:t>text forms,</w:t>
+      </w:r>
+      <w:r>
+        <w:t xml:space="preserve"> stripping them of idiosyncrasies and ambiguities, to </w:t>
+      </w:r>
+      <w:r>
+        <w:t>transform</w:t>
+      </w:r>
+      <w:r>
+        <w:t xml:space="preserve"> them into computable units of data. </w:t>
+      </w:r>
+      <w:r>
+        <w:t>The book then turns to fields</w:t>
+      </w:r>
+      <w:r>
+        <w:t xml:space="preserve"> like Queer Studies, Black Feminist Studies, and Trans Studies</w:t>
+      </w:r>
+      <w:r>
+        <w:t>, which</w:t>
+      </w:r>
+      <w:r>
+        <w:t xml:space="preserve"> inspire methodologies for working against these constraints—methodologies that destabilize authoritative and delimiting structures </w:t>
       </w:r>
       <w:r>
         <w:t>to</w:t>
@@ -86,7 +124,13 @@
         <w:t xml:space="preserve">these methodologies </w:t>
       </w:r>
       <w:r>
-        <w:t xml:space="preserve">into a new computational practice </w:t>
+        <w:t>into new computational practice</w:t>
+      </w:r>
+      <w:r>
+        <w:t>s</w:t>
+      </w:r>
+      <w:r>
+        <w:t xml:space="preserve"> </w:t>
       </w:r>
       <w:r>
         <w:t xml:space="preserve">that it tests </w:t>
@@ -2718,13 +2762,7 @@
         <w:t>According</w:t>
       </w:r>
       <w:r>
-        <w:t xml:space="preserve"> to </w:t>
-      </w:r>
-      <w:r>
-        <w:t>Black Feminist Studies</w:t>
-      </w:r>
-      <w:r>
-        <w:t>, for example, w</w:t>
+        <w:t xml:space="preserve"> to Black Feminist Studies, for example, w</w:t>
       </w:r>
       <w:r>
         <w:t xml:space="preserve">hen access to deeper, material processes is foreclosed, </w:t>

</xml_diff>

<commit_message>
finalized 4 & 5
</commit_message>
<xml_diff>
--- a/writings/calado_proposal.docx
+++ b/writings/calado_proposal.docx
@@ -54,15 +54,7 @@
         <w:t xml:space="preserve">computational processes that flatten the complexity of language data. It shows how certain computational tasks, </w:t>
       </w:r>
       <w:r>
-        <w:t xml:space="preserve">like language </w:t>
-      </w:r>
-      <w:proofErr w:type="spellStart"/>
-      <w:r>
-        <w:t>modeling</w:t>
-      </w:r>
-      <w:proofErr w:type="spellEnd"/>
-      <w:r>
-        <w:t>, for example</w:t>
+        <w:t>like language modeling, for example</w:t>
       </w:r>
       <w:r>
         <w:t xml:space="preserve">, constrain the expressive potential of </w:t>
@@ -242,7 +234,53 @@
         <w:t>prediction</w:t>
       </w:r>
       <w:r>
-        <w:t xml:space="preserve">. Chapter one, </w:t>
+        <w:t xml:space="preserve">. </w:t>
+      </w:r>
+      <w:r>
+        <w:t xml:space="preserve">Chapter one, “Text Capture,” </w:t>
+      </w:r>
+      <w:r>
+        <w:t>deploys</w:t>
+      </w:r>
+      <w:r>
+        <w:t xml:space="preserve"> web scraping to queer </w:t>
+      </w:r>
+      <w:r>
+        <w:t xml:space="preserve">digital protocols </w:t>
+      </w:r>
+      <w:r>
+        <w:t xml:space="preserve">of accumulation, which it </w:t>
+      </w:r>
+      <w:r>
+        <w:t>uses to explore</w:t>
+      </w:r>
+      <w:r>
+        <w:t xml:space="preserve"> </w:t>
+      </w:r>
+      <w:r>
+        <w:t xml:space="preserve">congressional documents and Jordy Rosenberg’s novel, </w:t>
+      </w:r>
+      <w:r>
+        <w:rPr>
+          <w:i/>
+          <w:iCs/>
+        </w:rPr>
+        <w:t>Confessions of the Fox</w:t>
+      </w:r>
+      <w:r>
+        <w:t xml:space="preserve"> (2018)</w:t>
+      </w:r>
+      <w:r>
+        <w:t xml:space="preserve">. </w:t>
+      </w:r>
+      <w:r>
+        <w:t xml:space="preserve">Chapter </w:t>
+      </w:r>
+      <w:r>
+        <w:t>two</w:t>
+      </w:r>
+      <w:r>
+        <w:t xml:space="preserve">, </w:t>
       </w:r>
       <w:r>
         <w:t>“</w:t>
@@ -277,7 +315,13 @@
         <w:t>(1928)</w:t>
       </w:r>
       <w:r>
-        <w:t xml:space="preserve">. Chapter two, </w:t>
+        <w:t xml:space="preserve">. Chapter </w:t>
+      </w:r>
+      <w:r>
+        <w:t>three</w:t>
+      </w:r>
+      <w:r>
+        <w:t xml:space="preserve">, </w:t>
       </w:r>
       <w:r>
         <w:t>“</w:t>
@@ -324,7 +368,13 @@
         <w:t>The</w:t>
       </w:r>
       <w:r>
-        <w:t xml:space="preserve"> third chapter </w:t>
+        <w:t xml:space="preserve"> </w:t>
+      </w:r>
+      <w:r>
+        <w:t>fourth</w:t>
+      </w:r>
+      <w:r>
+        <w:t xml:space="preserve"> chapter </w:t>
       </w:r>
       <w:r>
         <w:t>“</w:t>
@@ -348,7 +398,11 @@
         <w:t>in</w:t>
       </w:r>
       <w:r>
-        <w:t xml:space="preserve"> electronic formats, </w:t>
+        <w:t xml:space="preserve"> electronic </w:t>
+      </w:r>
+      <w:r>
+        <w:lastRenderedPageBreak/>
+        <w:t xml:space="preserve">formats, </w:t>
       </w:r>
       <w:r>
         <w:t>in a</w:t>
@@ -356,14 +410,12 @@
       <w:r>
         <w:t xml:space="preserve"> work of electronic literature, </w:t>
       </w:r>
-      <w:proofErr w:type="spellStart"/>
       <w:r>
         <w:rPr>
           <w:rStyle w:val="Emphasis"/>
         </w:rPr>
         <w:t>skinonskinonskin</w:t>
       </w:r>
-      <w:proofErr w:type="spellEnd"/>
       <w:r>
         <w:rPr>
           <w:rStyle w:val="Emphasis"/>
@@ -399,7 +451,13 @@
         <w:t>The</w:t>
       </w:r>
       <w:r>
-        <w:t xml:space="preserve"> fourth </w:t>
+        <w:t xml:space="preserve"> </w:t>
+      </w:r>
+      <w:r>
+        <w:t>fifth</w:t>
+      </w:r>
+      <w:r>
+        <w:t xml:space="preserve"> </w:t>
       </w:r>
       <w:r>
         <w:t xml:space="preserve">and final </w:t>
@@ -429,11 +487,7 @@
         <w:t xml:space="preserve">a </w:t>
       </w:r>
       <w:r>
-        <w:t xml:space="preserve">reality TV dating </w:t>
-      </w:r>
-      <w:r>
-        <w:lastRenderedPageBreak/>
-        <w:t xml:space="preserve">show, </w:t>
+        <w:t xml:space="preserve">reality TV dating show, </w:t>
       </w:r>
       <w:r>
         <w:rPr>
@@ -941,7 +995,14 @@
         <w:rPr>
           <w:rFonts w:cs="Times New Roman"/>
         </w:rPr>
-        <w:t xml:space="preserve"> and the trajectory of the field</w:t>
+        <w:t xml:space="preserve"> and the </w:t>
+      </w:r>
+      <w:r>
+        <w:rPr>
+          <w:rFonts w:cs="Times New Roman"/>
+        </w:rPr>
+        <w:lastRenderedPageBreak/>
+        <w:t>trajectory of the field</w:t>
       </w:r>
       <w:r>
         <w:rPr>
@@ -1045,14 +1106,7 @@
         <w:rPr>
           <w:rFonts w:cs="Times New Roman"/>
         </w:rPr>
-        <w:t xml:space="preserve"> pedagogical focus, which slowly builds technical </w:t>
-      </w:r>
-      <w:r>
-        <w:rPr>
-          <w:rFonts w:cs="Times New Roman"/>
-        </w:rPr>
-        <w:lastRenderedPageBreak/>
-        <w:t xml:space="preserve">knowledge over the course of four chapters, </w:t>
+        <w:t xml:space="preserve"> pedagogical focus, which slowly builds technical knowledge over the course of four chapters, </w:t>
       </w:r>
       <w:r>
         <w:rPr>
@@ -1959,7 +2013,14 @@
         <w:rPr>
           <w:rFonts w:cs="Times New Roman"/>
         </w:rPr>
-        <w:t xml:space="preserve">from mine and the other abovementioned works that </w:t>
+        <w:t xml:space="preserve">from mine </w:t>
+      </w:r>
+      <w:r>
+        <w:rPr>
+          <w:rFonts w:cs="Times New Roman"/>
+        </w:rPr>
+        <w:lastRenderedPageBreak/>
+        <w:t xml:space="preserve">and the other abovementioned works that </w:t>
       </w:r>
       <w:r>
         <w:rPr>
@@ -2005,8 +2066,61 @@
         <w:rPr>
           <w:rFonts w:cs="Times New Roman"/>
         </w:rPr>
-        <w:lastRenderedPageBreak/>
-        <w:t xml:space="preserve">The expected length of the total book is 55k works, spread over four chapters, an introduction, and a conclusion. In what follows, I offer a brief summary of each chapter and its contribution to the book as a whole. </w:t>
+        <w:t xml:space="preserve">The expected length of the total book is </w:t>
+      </w:r>
+      <w:r>
+        <w:rPr>
+          <w:rFonts w:cs="Times New Roman"/>
+        </w:rPr>
+        <w:t>6</w:t>
+      </w:r>
+      <w:r>
+        <w:rPr>
+          <w:rFonts w:cs="Times New Roman"/>
+        </w:rPr>
+        <w:t>5</w:t>
+      </w:r>
+      <w:r>
+        <w:rPr>
+          <w:rFonts w:cs="Times New Roman"/>
+        </w:rPr>
+        <w:t>k wor</w:t>
+      </w:r>
+      <w:r>
+        <w:rPr>
+          <w:rFonts w:cs="Times New Roman"/>
+        </w:rPr>
+        <w:t>d</w:t>
+      </w:r>
+      <w:r>
+        <w:rPr>
+          <w:rFonts w:cs="Times New Roman"/>
+        </w:rPr>
+        <w:t xml:space="preserve">s, </w:t>
+      </w:r>
+      <w:r>
+        <w:rPr>
+          <w:rFonts w:cs="Times New Roman"/>
+        </w:rPr>
+        <w:t>containing</w:t>
+      </w:r>
+      <w:r>
+        <w:rPr>
+          <w:rFonts w:cs="Times New Roman"/>
+        </w:rPr>
+        <w:t xml:space="preserve"> </w:t>
+      </w:r>
+      <w:r>
+        <w:rPr>
+          <w:rFonts w:cs="Times New Roman"/>
+        </w:rPr>
+        <w:t>five</w:t>
+      </w:r>
+      <w:r>
+        <w:rPr>
+          <w:rFonts w:cs="Times New Roman"/>
+        </w:rPr>
+        <w:t xml:space="preserve"> chapters, an introduction, and a conclusion. In what follows, I offer a brief summary of each chapter and its contribution to the book as a whole. </w:t>
       </w:r>
     </w:p>
     <w:p>
@@ -2014,315 +2128,307 @@
         <w:pStyle w:val="Textbody"/>
         <w:spacing w:line="480" w:lineRule="auto"/>
         <w:ind w:firstLine="709"/>
-      </w:pPr>
-      <w:r>
-        <w:t xml:space="preserve">Chapter One, </w:t>
-      </w:r>
-      <w:r>
-        <w:t>“</w:t>
-      </w:r>
-      <w:r>
-        <w:t>Text Analysis,</w:t>
-      </w:r>
-      <w:r>
-        <w:t>”</w:t>
-      </w:r>
-      <w:r>
-        <w:t xml:space="preserve"> explores text analysis</w:t>
-      </w:r>
-      <w:r>
-        <w:t xml:space="preserve"> using the Python programming language</w:t>
-      </w:r>
-      <w:r>
-        <w:t xml:space="preserve">. </w:t>
-      </w:r>
-      <w:r>
-        <w:t xml:space="preserve">It begins </w:t>
-      </w:r>
-      <w:r>
-        <w:t xml:space="preserve">with the most basic operation in text analysis, which is compiling word </w:t>
-      </w:r>
-      <w:r>
-        <w:t>frequencies</w:t>
-      </w:r>
-      <w:r>
-        <w:t xml:space="preserve"> through counting words and their contexts. In order to obtain accurate word counts, a text must first be </w:t>
-      </w:r>
-      <w:r>
-        <w:t>“</w:t>
-      </w:r>
-      <w:r>
-        <w:t>cleaned</w:t>
-      </w:r>
-      <w:r>
-        <w:t>”</w:t>
-      </w:r>
-      <w:r>
-        <w:t xml:space="preserve"> or standardized</w:t>
-      </w:r>
-      <w:r>
-        <w:t xml:space="preserve">, so that textual details like pronouns, capital letters, and word endings do not skew or misrepresent the word frequencies. </w:t>
-      </w:r>
-      <w:r>
-        <w:t>These textual elements, which convey subtle</w:t>
-      </w:r>
-      <w:r>
-        <w:t xml:space="preserve"> meanings and </w:t>
-      </w:r>
-      <w:r>
-        <w:t>contrasts</w:t>
-      </w:r>
-      <w:r>
-        <w:t>, are removed one by one</w:t>
-      </w:r>
-      <w:r>
-        <w:t xml:space="preserve"> </w:t>
-      </w:r>
-      <w:r>
-        <w:t xml:space="preserve">in a </w:t>
-      </w:r>
-      <w:r>
-        <w:t>repetitive</w:t>
-      </w:r>
-      <w:r>
-        <w:t xml:space="preserve"> process</w:t>
-      </w:r>
-      <w:r>
-        <w:t xml:space="preserve"> that is known </w:t>
-      </w:r>
-      <w:r>
-        <w:t xml:space="preserve">in programming languages as </w:t>
-      </w:r>
-      <w:r>
-        <w:t>“iteration</w:t>
-      </w:r>
-      <w:r>
-        <w:t>.</w:t>
-      </w:r>
-      <w:r>
-        <w:t>”</w:t>
-      </w:r>
-      <w:r>
-        <w:t xml:space="preserve"> </w:t>
-      </w:r>
-      <w:r>
-        <w:t xml:space="preserve">To push against this reductive mechanism, </w:t>
-      </w:r>
-      <w:r>
-        <w:t xml:space="preserve">which transforms each word into a standardized, computable format, </w:t>
-      </w:r>
-      <w:r>
-        <w:t>this chapter turns to</w:t>
-      </w:r>
-      <w:r>
-        <w:t xml:space="preserve"> Judith Butler's </w:t>
-      </w:r>
-      <w:r>
-        <w:t xml:space="preserve">theory of gender </w:t>
-      </w:r>
-      <w:proofErr w:type="spellStart"/>
-      <w:r>
-        <w:t>peformativity</w:t>
-      </w:r>
-      <w:proofErr w:type="spellEnd"/>
-      <w:r>
-        <w:t xml:space="preserve">. </w:t>
-      </w:r>
-      <w:r>
-        <w:t>Similarly to text analysis</w:t>
-      </w:r>
-      <w:r>
-        <w:t>,</w:t>
-      </w:r>
-      <w:r>
-        <w:t xml:space="preserve"> gender performativity is based on </w:t>
-      </w:r>
-      <w:r>
-        <w:t>a</w:t>
-      </w:r>
-      <w:r>
-        <w:t xml:space="preserve"> cyclical</w:t>
-      </w:r>
-      <w:r>
-        <w:t xml:space="preserve"> operation</w:t>
-      </w:r>
-      <w:r>
-        <w:t>, which Butler calls “</w:t>
-      </w:r>
-      <w:proofErr w:type="spellStart"/>
-      <w:r>
-        <w:t>iterativity</w:t>
-      </w:r>
-      <w:proofErr w:type="spellEnd"/>
-      <w:r>
-        <w:t>,”</w:t>
-      </w:r>
-      <w:r>
-        <w:t xml:space="preserve"> that repeat</w:t>
-      </w:r>
-      <w:r>
-        <w:t>s</w:t>
-      </w:r>
-      <w:r>
-        <w:t xml:space="preserve"> </w:t>
-      </w:r>
-      <w:r>
-        <w:t>a</w:t>
-      </w:r>
-      <w:r>
-        <w:t xml:space="preserve"> specific series of actions</w:t>
-      </w:r>
-      <w:r>
-        <w:t xml:space="preserve"> with the effect of dismantling </w:t>
-      </w:r>
-      <w:r>
-        <w:t xml:space="preserve">its </w:t>
-      </w:r>
-      <w:r>
-        <w:t>entrenched</w:t>
-      </w:r>
-      <w:r>
-        <w:t xml:space="preserve"> meanings</w:t>
-      </w:r>
-      <w:r>
-        <w:t>.</w:t>
-      </w:r>
-      <w:r>
-        <w:t xml:space="preserve"> </w:t>
-      </w:r>
-      <w:r>
-        <w:t>The chapter</w:t>
-      </w:r>
-      <w:r>
-        <w:t xml:space="preserve"> then take</w:t>
-      </w:r>
-      <w:r>
-        <w:t>s</w:t>
-      </w:r>
-      <w:r>
-        <w:t xml:space="preserve"> gender performativity</w:t>
-      </w:r>
-      <w:r>
-        <w:t xml:space="preserve"> </w:t>
-      </w:r>
-      <w:r>
-        <w:t>into a new text analysis pra</w:t>
-      </w:r>
-      <w:r>
-        <w:t>c</w:t>
-      </w:r>
-      <w:r>
-        <w:t xml:space="preserve">tice to study gender forms in Virginia Woolf's novel, </w:t>
-      </w:r>
-      <w:r>
-        <w:rPr>
-          <w:rStyle w:val="Emphasis"/>
-        </w:rPr>
-        <w:t>Orlando: A Biography</w:t>
-      </w:r>
-      <w:r>
-        <w:t xml:space="preserve"> (1928). Butler's understanding of </w:t>
-      </w:r>
-      <w:proofErr w:type="spellStart"/>
-      <w:r>
-        <w:t>iterativity</w:t>
-      </w:r>
-      <w:proofErr w:type="spellEnd"/>
-      <w:r>
-        <w:t xml:space="preserve"> </w:t>
-      </w:r>
-      <w:r>
-        <w:t>introduce</w:t>
-      </w:r>
-      <w:r>
-        <w:t>s</w:t>
-      </w:r>
-      <w:r>
-        <w:t xml:space="preserve"> randomness </w:t>
-      </w:r>
-      <w:r>
-        <w:t xml:space="preserve">into the </w:t>
-      </w:r>
-      <w:r>
-        <w:t xml:space="preserve">rigid and repetitive </w:t>
-      </w:r>
-      <w:r>
-        <w:t>text analysis process</w:t>
-      </w:r>
-      <w:r>
-        <w:t>,</w:t>
-      </w:r>
-      <w:r>
-        <w:t xml:space="preserve"> </w:t>
-      </w:r>
-      <w:r>
-        <w:t>open</w:t>
-      </w:r>
-      <w:r>
-        <w:t>ing</w:t>
-      </w:r>
-      <w:r>
-        <w:t xml:space="preserve"> </w:t>
-      </w:r>
-      <w:r>
-        <w:t>the potential for re-signifying gender terms and creating new associations in W</w:t>
-      </w:r>
-      <w:r>
-        <w:t>oolf’s</w:t>
-      </w:r>
-      <w:r>
-        <w:t xml:space="preserve"> novel</w:t>
-      </w:r>
-      <w:r>
-        <w:t xml:space="preserve">. </w:t>
-      </w:r>
-      <w:r>
-        <w:t xml:space="preserve">The </w:t>
-      </w:r>
-      <w:r>
-        <w:t xml:space="preserve">chapter </w:t>
-      </w:r>
-      <w:r>
-        <w:t xml:space="preserve">closes </w:t>
-      </w:r>
-      <w:r>
-        <w:t xml:space="preserve">with some recent critiques of </w:t>
-      </w:r>
-      <w:r>
-        <w:t>g</w:t>
-      </w:r>
-      <w:r>
-        <w:t xml:space="preserve">ender </w:t>
-      </w:r>
-      <w:r>
-        <w:t>p</w:t>
-      </w:r>
-      <w:r>
-        <w:t>erformativity and its limitations as a discursive method</w:t>
-      </w:r>
-      <w:r>
-        <w:t>—</w:t>
-      </w:r>
-      <w:r>
-        <w:t xml:space="preserve">a problem </w:t>
-      </w:r>
-      <w:r>
-        <w:t xml:space="preserve">that the </w:t>
-      </w:r>
-      <w:r>
-        <w:t>final chapter</w:t>
-      </w:r>
-      <w:r>
-        <w:t xml:space="preserve"> addresses </w:t>
-      </w:r>
-      <w:r>
-        <w:t>from</w:t>
-      </w:r>
-      <w:r>
-        <w:t xml:space="preserve"> recent perspectives in Trans Studies</w:t>
-      </w:r>
-      <w:r>
-        <w:t xml:space="preserve">. </w:t>
+        <w:rPr>
+          <w:rFonts w:cs="Times New Roman"/>
+        </w:rPr>
+      </w:pPr>
+      <w:r>
+        <w:rPr>
+          <w:rFonts w:cs="Times New Roman"/>
+        </w:rPr>
+        <w:t>Beginning with a close reading of Caitlin Fisher’s hypertext fictio</w:t>
+      </w:r>
+      <w:r>
+        <w:rPr>
+          <w:rFonts w:cs="Times New Roman"/>
+        </w:rPr>
+        <w:t xml:space="preserve">n, </w:t>
+      </w:r>
+      <w:r>
+        <w:rPr>
+          <w:rFonts w:cs="Times New Roman"/>
+          <w:i/>
+          <w:iCs/>
+        </w:rPr>
+        <w:t>These Waves of Girls</w:t>
+      </w:r>
+      <w:r>
+        <w:rPr>
+          <w:rFonts w:cs="Times New Roman"/>
+        </w:rPr>
+        <w:t xml:space="preserve"> (2001), </w:t>
+      </w:r>
+      <w:r>
+        <w:rPr>
+          <w:rFonts w:cs="Times New Roman"/>
+        </w:rPr>
+        <w:t xml:space="preserve">the Introduction chapter explores how </w:t>
+      </w:r>
+      <w:r>
+        <w:rPr>
+          <w:rFonts w:cs="Times New Roman"/>
+        </w:rPr>
+        <w:t xml:space="preserve">Digital Humanities work, </w:t>
+      </w:r>
+      <w:r>
+        <w:rPr>
+          <w:rFonts w:cs="Times New Roman"/>
+        </w:rPr>
+        <w:t xml:space="preserve">especially that based in </w:t>
+      </w:r>
+      <w:r>
+        <w:rPr>
+          <w:rFonts w:cs="Times New Roman"/>
+        </w:rPr>
+        <w:t xml:space="preserve">Literary Studies contexts, </w:t>
+      </w:r>
+      <w:r>
+        <w:rPr>
+          <w:rFonts w:cs="Times New Roman"/>
+        </w:rPr>
+        <w:t>approach</w:t>
+      </w:r>
+      <w:r>
+        <w:rPr>
+          <w:rFonts w:cs="Times New Roman"/>
+        </w:rPr>
+        <w:t xml:space="preserve"> </w:t>
+      </w:r>
+      <w:r>
+        <w:rPr>
+          <w:rFonts w:cs="Times New Roman"/>
+        </w:rPr>
+        <w:t xml:space="preserve">digital form </w:t>
+      </w:r>
+      <w:r>
+        <w:rPr>
+          <w:rFonts w:cs="Times New Roman"/>
+        </w:rPr>
+        <w:t xml:space="preserve">as a realm of </w:t>
+      </w:r>
+      <w:r>
+        <w:rPr>
+          <w:rFonts w:cs="Times New Roman"/>
+        </w:rPr>
+        <w:t xml:space="preserve">interpretive </w:t>
+      </w:r>
+      <w:r>
+        <w:rPr>
+          <w:rFonts w:cs="Times New Roman"/>
+        </w:rPr>
+        <w:t>possibility.</w:t>
+      </w:r>
+      <w:r>
+        <w:rPr>
+          <w:rFonts w:cs="Times New Roman"/>
+        </w:rPr>
+        <w:t xml:space="preserve"> This</w:t>
+      </w:r>
+      <w:r>
+        <w:rPr>
+          <w:rFonts w:cs="Times New Roman"/>
+        </w:rPr>
+        <w:t xml:space="preserve"> line of</w:t>
+      </w:r>
+      <w:r>
+        <w:rPr>
+          <w:rFonts w:cs="Times New Roman"/>
+        </w:rPr>
+        <w:t xml:space="preserve"> DH</w:t>
+      </w:r>
+      <w:r>
+        <w:rPr>
+          <w:rFonts w:cs="Times New Roman"/>
+        </w:rPr>
+        <w:t xml:space="preserve"> isolates the digital constraint—the reductive forms and logics required by computational processing—as a necessary context fo</w:t>
+      </w:r>
+      <w:r>
+        <w:rPr>
+          <w:rFonts w:cs="Times New Roman"/>
+        </w:rPr>
+        <w:t>r</w:t>
+      </w:r>
+      <w:r>
+        <w:rPr>
+          <w:rFonts w:cs="Times New Roman"/>
+        </w:rPr>
+        <w:t xml:space="preserve"> critical interpretation </w:t>
+      </w:r>
+      <w:r>
+        <w:rPr>
+          <w:rFonts w:cs="Times New Roman"/>
+        </w:rPr>
+        <w:t>to</w:t>
+      </w:r>
+      <w:r>
+        <w:rPr>
+          <w:rFonts w:cs="Times New Roman"/>
+        </w:rPr>
+        <w:t xml:space="preserve"> flourish.</w:t>
+      </w:r>
+      <w:r>
+        <w:rPr>
+          <w:rFonts w:cs="Times New Roman"/>
+        </w:rPr>
+        <w:t xml:space="preserve"> </w:t>
+      </w:r>
+      <w:r>
+        <w:rPr>
+          <w:rFonts w:cs="Times New Roman"/>
+        </w:rPr>
+        <w:t>For the hypertext work, this perspective emerges in frequent readings of the hypertext format, where pages of the work are linked through words and phrases, creating at the same time a confusingly associative and highly addicti</w:t>
+      </w:r>
+      <w:r>
+        <w:rPr>
+          <w:rFonts w:cs="Times New Roman"/>
+        </w:rPr>
+        <w:t>ng</w:t>
+      </w:r>
+      <w:r>
+        <w:rPr>
+          <w:rFonts w:cs="Times New Roman"/>
+        </w:rPr>
+        <w:t xml:space="preserve"> storytelling technique. </w:t>
+      </w:r>
+      <w:r>
+        <w:rPr>
+          <w:rFonts w:cs="Times New Roman"/>
+        </w:rPr>
+        <w:t xml:space="preserve">While this formalist critical approach can be productive and exciting, this introduction (and the book at large) argues that it misses the deeper structures of power that undergird digital tools and processes. Because digital phenomena mirror cultural and social structures, they necessary perpetuate systems of control based on encoding </w:t>
+      </w:r>
+      <w:r>
+        <w:rPr>
+          <w:rFonts w:cs="Times New Roman"/>
+        </w:rPr>
+        <w:t xml:space="preserve">identity, </w:t>
+      </w:r>
+      <w:r>
+        <w:rPr>
+          <w:rFonts w:cs="Times New Roman"/>
+        </w:rPr>
+        <w:t xml:space="preserve">especially aspects of </w:t>
+      </w:r>
+      <w:r>
+        <w:rPr>
+          <w:rFonts w:cs="Times New Roman"/>
+        </w:rPr>
+        <w:t xml:space="preserve">sex, gender, and sexuality, into computable units. The question then becomes how one can work toward a counter practice, a </w:t>
+      </w:r>
+      <w:r>
+        <w:rPr>
+          <w:rFonts w:cs="Times New Roman"/>
+          <w:i/>
+          <w:iCs/>
+        </w:rPr>
+        <w:t>counter-code</w:t>
+      </w:r>
+      <w:r>
+        <w:rPr>
+          <w:rFonts w:cs="Times New Roman"/>
+        </w:rPr>
+        <w:t xml:space="preserve">. It </w:t>
+      </w:r>
+      <w:r>
+        <w:rPr>
+          <w:rFonts w:cs="Times New Roman"/>
+        </w:rPr>
+        <w:t xml:space="preserve">illustrates an example of this reading on the </w:t>
+      </w:r>
+      <w:r>
+        <w:rPr>
+          <w:rFonts w:cs="Times New Roman"/>
+        </w:rPr>
+        <w:t xml:space="preserve">hypertext </w:t>
+      </w:r>
+      <w:r>
+        <w:rPr>
+          <w:rFonts w:cs="Times New Roman"/>
+        </w:rPr>
+        <w:t xml:space="preserve">work which it analyses </w:t>
+      </w:r>
+      <w:r>
+        <w:rPr>
+          <w:rFonts w:cs="Times New Roman"/>
+        </w:rPr>
+        <w:t>alongside contemporary social media feeds draws out how</w:t>
+      </w:r>
+      <w:r>
+        <w:rPr>
+          <w:rFonts w:cs="Times New Roman"/>
+        </w:rPr>
+        <w:t xml:space="preserve"> the</w:t>
+      </w:r>
+      <w:r>
+        <w:rPr>
+          <w:rFonts w:cs="Times New Roman"/>
+        </w:rPr>
+        <w:t xml:space="preserve"> </w:t>
+      </w:r>
+      <w:r>
+        <w:rPr>
+          <w:rFonts w:cs="Times New Roman"/>
+        </w:rPr>
+        <w:t xml:space="preserve">teenage </w:t>
+      </w:r>
+      <w:r>
+        <w:rPr>
+          <w:rFonts w:cs="Times New Roman"/>
+        </w:rPr>
+        <w:t>desire</w:t>
+      </w:r>
+      <w:r>
+        <w:rPr>
+          <w:rFonts w:cs="Times New Roman"/>
+        </w:rPr>
+        <w:t>s in this work</w:t>
+      </w:r>
+      <w:r>
+        <w:rPr>
+          <w:rFonts w:cs="Times New Roman"/>
+        </w:rPr>
+        <w:t xml:space="preserve"> operate</w:t>
+      </w:r>
+      <w:r>
+        <w:rPr>
+          <w:rFonts w:cs="Times New Roman"/>
+        </w:rPr>
+        <w:t xml:space="preserve"> in tandem with predatory interface effects that are designed to monopolize attention. Reading the formal constraints alone misses the ways that control operates as a structuring device in the work—a topic which it returns to in the conclusion of the book, </w:t>
+      </w:r>
+      <w:r>
+        <w:rPr>
+          <w:rFonts w:cs="Times New Roman"/>
+        </w:rPr>
+        <w:t xml:space="preserve">in the context of social media bots. </w:t>
+      </w:r>
+      <w:r>
+        <w:rPr>
+          <w:rFonts w:cs="Times New Roman"/>
+        </w:rPr>
+        <w:t xml:space="preserve">The rest of the introduction then </w:t>
+      </w:r>
+      <w:r>
+        <w:rPr>
+          <w:rFonts w:cs="Times New Roman"/>
+        </w:rPr>
+        <w:t xml:space="preserve">reviews the five computational constraints taken up by each </w:t>
+      </w:r>
+      <w:r>
+        <w:rPr>
+          <w:rFonts w:cs="Times New Roman"/>
+        </w:rPr>
+        <w:t xml:space="preserve">of the subsequent </w:t>
+      </w:r>
+      <w:r>
+        <w:rPr>
+          <w:rFonts w:cs="Times New Roman"/>
+        </w:rPr>
+        <w:t>chapter in the book: protocol, iteration, containment, abstraction, and aggregation.</w:t>
+      </w:r>
+      <w:r>
+        <w:rPr>
+          <w:rFonts w:cs="Times New Roman"/>
+        </w:rPr>
+        <w:t xml:space="preserve"> </w:t>
       </w:r>
     </w:p>
     <w:p>
@@ -2332,250 +2438,487 @@
         <w:ind w:firstLine="709"/>
       </w:pPr>
       <w:r>
-        <w:t xml:space="preserve">Moving from text analysis to text encoding, Chapter Two, </w:t>
-      </w:r>
-      <w:r>
-        <w:t>“</w:t>
-      </w:r>
-      <w:r>
-        <w:t>Text Preservation</w:t>
-      </w:r>
-      <w:r>
-        <w:t>”</w:t>
-      </w:r>
-      <w:r>
-        <w:t xml:space="preserve"> examines the Text Encoding Init</w:t>
-      </w:r>
-      <w:r>
-        <w:t>i</w:t>
-      </w:r>
-      <w:r>
-        <w:t xml:space="preserve">ative (TEI), a </w:t>
-      </w:r>
-      <w:r>
-        <w:t>popular standard for digitizing literary material</w:t>
-      </w:r>
-      <w:r>
+        <w:rPr>
+          <w:rFonts w:cs="Times New Roman"/>
+        </w:rPr>
+        <w:lastRenderedPageBreak/>
+        <w:t xml:space="preserve">Chapter </w:t>
+      </w:r>
+      <w:r>
+        <w:rPr>
+          <w:rFonts w:cs="Times New Roman"/>
+        </w:rPr>
+        <w:t>One</w:t>
+      </w:r>
+      <w:r>
+        <w:rPr>
+          <w:rFonts w:cs="Times New Roman"/>
+        </w:rPr>
+        <w:t xml:space="preserve">, “Text Capture,” explores </w:t>
+      </w:r>
+      <w:r>
+        <w:rPr>
+          <w:rFonts w:cs="Times New Roman"/>
+        </w:rPr>
+        <w:t xml:space="preserve">the constraint of “protocol” in the context of </w:t>
+      </w:r>
+      <w:r>
+        <w:rPr>
+          <w:rFonts w:cs="Times New Roman"/>
+        </w:rPr>
+        <w:t xml:space="preserve">web scraping, a popular method for gathering </w:t>
+      </w:r>
+      <w:r>
+        <w:rPr>
+          <w:rFonts w:cs="Times New Roman"/>
+        </w:rPr>
+        <w:t xml:space="preserve">text </w:t>
+      </w:r>
+      <w:r>
+        <w:rPr>
+          <w:rFonts w:cs="Times New Roman"/>
+        </w:rPr>
+        <w:t xml:space="preserve">data over the internet. </w:t>
+      </w:r>
+      <w:r>
+        <w:rPr>
+          <w:rFonts w:cs="Times New Roman"/>
+        </w:rPr>
+        <w:t>On a technical level, w</w:t>
+      </w:r>
+      <w:r>
+        <w:rPr>
+          <w:rFonts w:cs="Times New Roman"/>
+        </w:rPr>
+        <w:t xml:space="preserve">eb scraping </w:t>
+      </w:r>
+      <w:r>
+        <w:rPr>
+          <w:rFonts w:cs="Times New Roman"/>
+        </w:rPr>
+        <w:t xml:space="preserve">involves manipulating </w:t>
+      </w:r>
+      <w:r>
+        <w:rPr>
+          <w:rFonts w:cs="Times New Roman"/>
+        </w:rPr>
+        <w:t>network protocols to extract text</w:t>
+      </w:r>
+      <w:r>
+        <w:rPr>
+          <w:rFonts w:cs="Times New Roman"/>
+        </w:rPr>
+        <w:t>,</w:t>
+      </w:r>
+      <w:r>
+        <w:rPr>
+          <w:rFonts w:cs="Times New Roman"/>
+        </w:rPr>
+        <w:t xml:space="preserve"> stored within</w:t>
+      </w:r>
+      <w:r>
+        <w:rPr>
+          <w:rFonts w:cs="Times New Roman"/>
+        </w:rPr>
+        <w:t xml:space="preserve"> HTML files</w:t>
+      </w:r>
+      <w:r>
+        <w:rPr>
+          <w:rFonts w:cs="Times New Roman"/>
+        </w:rPr>
+        <w:t>, from websites</w:t>
+      </w:r>
+      <w:r>
+        <w:rPr>
+          <w:rFonts w:cs="Times New Roman"/>
+        </w:rPr>
         <w:t xml:space="preserve">. </w:t>
       </w:r>
       <w:r>
-        <w:t xml:space="preserve">The TEI consists of a set of </w:t>
-      </w:r>
-      <w:r>
-        <w:t xml:space="preserve">rules </w:t>
-      </w:r>
-      <w:r>
-        <w:t xml:space="preserve">for tagging, or </w:t>
-      </w:r>
-      <w:r>
-        <w:t>“</w:t>
-      </w:r>
-      <w:r>
-        <w:t>encoding,</w:t>
-      </w:r>
-      <w:r>
-        <w:t>”</w:t>
-      </w:r>
-      <w:r>
-        <w:t xml:space="preserve"> </w:t>
-      </w:r>
-      <w:r>
-        <w:t xml:space="preserve">print texts and manuscripts </w:t>
-      </w:r>
-      <w:r>
-        <w:t>into electronic formats</w:t>
-      </w:r>
-      <w:r>
-        <w:t xml:space="preserve">. The TEI requires that text be sorted into a rigid, hierarchical </w:t>
-      </w:r>
-      <w:r>
-        <w:t>structure</w:t>
-      </w:r>
-      <w:r>
-        <w:t>, where inner</w:t>
-      </w:r>
-      <w:r>
+        <w:rPr>
+          <w:rFonts w:cs="Times New Roman"/>
+        </w:rPr>
+        <w:t>In order to</w:t>
+      </w:r>
+      <w:r>
+        <w:rPr>
+          <w:rFonts w:cs="Times New Roman"/>
+        </w:rPr>
+        <w:t xml:space="preserve"> </w:t>
+      </w:r>
+      <w:r>
+        <w:rPr>
+          <w:rFonts w:cs="Times New Roman"/>
+        </w:rPr>
+        <w:t>extract this data, web scraping programs</w:t>
+      </w:r>
+      <w:r>
+        <w:rPr>
+          <w:rFonts w:cs="Times New Roman"/>
+        </w:rPr>
+        <w:t xml:space="preserve"> must </w:t>
+      </w:r>
+      <w:r>
+        <w:rPr>
+          <w:rFonts w:cs="Times New Roman"/>
+        </w:rPr>
+        <w:t>effectively mimic</w:t>
+      </w:r>
+      <w:r>
+        <w:rPr>
+          <w:rFonts w:cs="Times New Roman"/>
+        </w:rPr>
+        <w:t xml:space="preserve"> a web browser</w:t>
+      </w:r>
+      <w:r>
+        <w:rPr>
+          <w:rFonts w:cs="Times New Roman"/>
+        </w:rPr>
+        <w:t xml:space="preserve"> and</w:t>
+      </w:r>
+      <w:r>
+        <w:rPr>
+          <w:rFonts w:cs="Times New Roman"/>
+        </w:rPr>
+        <w:t xml:space="preserve"> </w:t>
+      </w:r>
+      <w:r>
+        <w:rPr>
+          <w:rFonts w:cs="Times New Roman"/>
+        </w:rPr>
+        <w:t xml:space="preserve">adhere to </w:t>
+      </w:r>
+      <w:r>
+        <w:rPr>
+          <w:rFonts w:cs="Times New Roman"/>
+        </w:rPr>
+        <w:t>browser</w:t>
+      </w:r>
+      <w:r>
+        <w:rPr>
+          <w:rFonts w:cs="Times New Roman"/>
+        </w:rPr>
+        <w:t xml:space="preserve"> protocols</w:t>
+      </w:r>
+      <w:r>
+        <w:rPr>
+          <w:rFonts w:cs="Times New Roman"/>
+        </w:rPr>
+        <w:t xml:space="preserve"> for sending and requesting data over the network</w:t>
+      </w:r>
+      <w:r>
+        <w:rPr>
+          <w:rFonts w:cs="Times New Roman"/>
+        </w:rPr>
+        <w:t>. In recent years, however, web scraping has become significantly more difficult d</w:t>
+      </w:r>
+      <w:r>
+        <w:rPr>
+          <w:rFonts w:cs="Times New Roman"/>
+        </w:rPr>
+        <w:t xml:space="preserve">ue </w:t>
+      </w:r>
+      <w:r>
+        <w:rPr>
+          <w:rFonts w:cs="Times New Roman"/>
+        </w:rPr>
+        <w:t>to</w:t>
+      </w:r>
+      <w:r>
+        <w:rPr>
+          <w:rFonts w:cs="Times New Roman"/>
+        </w:rPr>
+        <w:t xml:space="preserve"> </w:t>
+      </w:r>
+      <w:r>
+        <w:rPr>
+          <w:rFonts w:cs="Times New Roman"/>
+        </w:rPr>
+        <w:t xml:space="preserve">the </w:t>
+      </w:r>
+      <w:r>
+        <w:rPr>
+          <w:rFonts w:cs="Times New Roman"/>
+        </w:rPr>
+        <w:t>hunger for text data</w:t>
+      </w:r>
+      <w:r>
+        <w:rPr>
+          <w:rFonts w:cs="Times New Roman"/>
+        </w:rPr>
+        <w:t xml:space="preserve"> by by </w:t>
+      </w:r>
+      <w:r>
+        <w:rPr>
+          <w:rFonts w:cs="Times New Roman"/>
+        </w:rPr>
+        <w:t xml:space="preserve">Large Language Model (LLM) </w:t>
+      </w:r>
+      <w:r>
+        <w:rPr>
+          <w:rFonts w:cs="Times New Roman"/>
+        </w:rPr>
+        <w:t>developers</w:t>
+      </w:r>
+      <w:r>
+        <w:rPr>
+          <w:rFonts w:cs="Times New Roman"/>
+        </w:rPr>
+        <w:t xml:space="preserve">. As </w:t>
+      </w:r>
+      <w:r>
+        <w:rPr>
+          <w:rFonts w:cs="Times New Roman"/>
+        </w:rPr>
+        <w:t xml:space="preserve">these developers capture virtually all the </w:t>
+      </w:r>
+      <w:r>
+        <w:rPr>
+          <w:rFonts w:cs="Times New Roman"/>
+        </w:rPr>
+        <w:t xml:space="preserve">public </w:t>
+      </w:r>
+      <w:r>
+        <w:rPr>
+          <w:rFonts w:cs="Times New Roman"/>
+        </w:rPr>
+        <w:t xml:space="preserve">data </w:t>
+      </w:r>
+      <w:r>
+        <w:rPr>
+          <w:rFonts w:cs="Times New Roman"/>
+        </w:rPr>
+        <w:t xml:space="preserve">on the web for LLM </w:t>
+      </w:r>
+      <w:r>
+        <w:rPr>
+          <w:rFonts w:cs="Times New Roman"/>
+        </w:rPr>
+        <w:t xml:space="preserve">training </w:t>
+      </w:r>
+      <w:r>
+        <w:rPr>
+          <w:rFonts w:cs="Times New Roman"/>
+        </w:rPr>
+        <w:t>purposes</w:t>
+      </w:r>
+      <w:r>
+        <w:rPr>
+          <w:rFonts w:cs="Times New Roman"/>
+        </w:rPr>
+        <w:t xml:space="preserve">, websites are </w:t>
+      </w:r>
+      <w:r>
+        <w:rPr>
+          <w:rFonts w:cs="Times New Roman"/>
+        </w:rPr>
+        <w:t xml:space="preserve">quickly </w:t>
+      </w:r>
+      <w:r>
+        <w:rPr>
+          <w:rFonts w:cs="Times New Roman"/>
+        </w:rPr>
+        <w:t xml:space="preserve">closing down access to their HTML files. This chapter looks at the accumulative logics behind exploitative web scraping practices and </w:t>
+      </w:r>
+      <w:r>
+        <w:rPr>
+          <w:rFonts w:cs="Times New Roman"/>
+        </w:rPr>
+        <w:t xml:space="preserve">considers </w:t>
+      </w:r>
+      <w:r>
+        <w:rPr>
+          <w:rFonts w:cs="Times New Roman"/>
+        </w:rPr>
+        <w:t xml:space="preserve">how one might re-purpose </w:t>
+      </w:r>
+      <w:r>
+        <w:rPr>
+          <w:rFonts w:cs="Times New Roman"/>
+        </w:rPr>
+        <w:t>them against privatization</w:t>
+      </w:r>
+      <w:r>
+        <w:rPr>
+          <w:rFonts w:cs="Times New Roman"/>
+        </w:rPr>
+        <w:t xml:space="preserve">. </w:t>
+      </w:r>
+      <w:r>
+        <w:rPr>
+          <w:rFonts w:cs="Times New Roman"/>
+        </w:rPr>
+        <w:t xml:space="preserve">To do so, it draws from </w:t>
+      </w:r>
+      <w:r>
+        <w:rPr>
+          <w:rFonts w:cs="Times New Roman"/>
+        </w:rPr>
+        <w:t>proto-</w:t>
+      </w:r>
+      <w:r>
+        <w:rPr>
+          <w:rFonts w:cs="Times New Roman"/>
+        </w:rPr>
+        <w:t>Queer</w:t>
+      </w:r>
+      <w:r>
+        <w:rPr>
+          <w:rFonts w:cs="Times New Roman"/>
+        </w:rPr>
         <w:t>,</w:t>
       </w:r>
       <w:r>
-        <w:t xml:space="preserve"> </w:t>
-      </w:r>
-      <w:r>
-        <w:t>“</w:t>
-      </w:r>
-      <w:r>
-        <w:t>child</w:t>
-      </w:r>
-      <w:r>
-        <w:t>”</w:t>
-      </w:r>
-      <w:r>
-        <w:t xml:space="preserve"> elements are bound within their outer</w:t>
-      </w:r>
-      <w:r>
+        <w:rPr>
+          <w:rFonts w:cs="Times New Roman"/>
+        </w:rPr>
+        <w:t xml:space="preserve"> Chicana scholar,</w:t>
+      </w:r>
+      <w:r>
+        <w:rPr>
+          <w:rFonts w:cs="Times New Roman"/>
+        </w:rPr>
+        <w:t xml:space="preserve"> </w:t>
+      </w:r>
+      <w:r>
+        <w:rPr>
+          <w:rFonts w:cs="Times New Roman"/>
+        </w:rPr>
+        <w:t>Gloria Anzaldúa</w:t>
+      </w:r>
+      <w:r>
+        <w:rPr>
+          <w:rFonts w:cs="Times New Roman"/>
+        </w:rPr>
         <w:t>,</w:t>
       </w:r>
       <w:r>
-        <w:t xml:space="preserve"> </w:t>
-      </w:r>
-      <w:r>
-        <w:t>“</w:t>
-      </w:r>
-      <w:r>
-        <w:t>parent</w:t>
-      </w:r>
-      <w:r>
-        <w:t>”</w:t>
-      </w:r>
-      <w:r>
-        <w:t xml:space="preserve"> element.</w:t>
-      </w:r>
-      <w:r>
-        <w:t xml:space="preserve"> Syntactic and semantic forms of language are thus fixed </w:t>
-      </w:r>
-      <w:r>
-        <w:lastRenderedPageBreak/>
-        <w:t xml:space="preserve">and disambiguated into discrete elements within an ordered hierarchy. </w:t>
-      </w:r>
-      <w:r>
-        <w:t xml:space="preserve">To resist this top-down </w:t>
-      </w:r>
-      <w:r>
-        <w:t>containment of data,</w:t>
-      </w:r>
-      <w:r>
-        <w:t xml:space="preserve"> </w:t>
-      </w:r>
-      <w:r>
-        <w:t>in the TEI</w:t>
+        <w:t xml:space="preserve"> who in </w:t>
+      </w:r>
+      <w:r>
+        <w:rPr>
+          <w:i/>
+          <w:iCs/>
+        </w:rPr>
+        <w:t>Borderlands/La Frontera: The New Mestiza</w:t>
+      </w:r>
+      <w:r>
+        <w:t xml:space="preserve"> (1987) bases </w:t>
+      </w:r>
+      <w:r>
+        <w:t>her</w:t>
+      </w:r>
+      <w:r>
+        <w:t xml:space="preserve"> theory of </w:t>
+      </w:r>
+      <w:r>
+        <w:t>cross-</w:t>
+      </w:r>
+      <w:r>
+        <w:t xml:space="preserve">cultural hybridity </w:t>
+      </w:r>
+      <w:r>
+        <w:t>and communication</w:t>
+      </w:r>
+      <w:r>
+        <w:t xml:space="preserve">, called </w:t>
+      </w:r>
+      <w:r>
+        <w:rPr>
+          <w:i/>
+          <w:iCs/>
+        </w:rPr>
+        <w:t>borderlands</w:t>
+      </w:r>
+      <w:r>
+        <w:t xml:space="preserve"> </w:t>
+      </w:r>
+      <w:r>
+        <w:rPr>
+          <w:i/>
+          <w:iCs/>
+        </w:rPr>
+        <w:t>theory</w:t>
       </w:r>
       <w:r>
         <w:t xml:space="preserve">, </w:t>
       </w:r>
       <w:r>
-        <w:t>the chapter</w:t>
-      </w:r>
-      <w:r>
-        <w:t xml:space="preserve"> turn</w:t>
-      </w:r>
-      <w:r>
-        <w:t>s</w:t>
-      </w:r>
-      <w:r>
-        <w:t xml:space="preserve"> to the strategy of disidentification, theorized by Queer of </w:t>
-      </w:r>
-      <w:proofErr w:type="spellStart"/>
-      <w:r>
-        <w:t>Color</w:t>
-      </w:r>
-      <w:proofErr w:type="spellEnd"/>
-      <w:r>
-        <w:t xml:space="preserve"> Critique scholar José Esteban Muñoz. Disidentification, which is a method for re-appropriating dominant codes, offers a useful heuristic for grappling with the rigid boundaries </w:t>
-      </w:r>
-      <w:r>
-        <w:t xml:space="preserve">and protocols </w:t>
-      </w:r>
-      <w:r>
-        <w:t xml:space="preserve">of the TEI. </w:t>
-      </w:r>
-      <w:r>
-        <w:t>The chapter</w:t>
-      </w:r>
-      <w:r>
-        <w:t xml:space="preserve"> </w:t>
-      </w:r>
-      <w:r>
-        <w:t>appl</w:t>
-      </w:r>
-      <w:r>
-        <w:t>ies</w:t>
-      </w:r>
-      <w:r>
-        <w:t xml:space="preserve"> this strategy to encode the revisions that Oscar Wilde made to his novel, </w:t>
-      </w:r>
-      <w:r>
-        <w:rPr>
-          <w:rStyle w:val="Emphasis"/>
-        </w:rPr>
-        <w:t>The Picture of Dorian Gray</w:t>
-      </w:r>
-      <w:r>
-        <w:t xml:space="preserve">, prior to its publication in 1890. </w:t>
-      </w:r>
-      <w:r>
-        <w:t xml:space="preserve">This manuscript reveals traces of homosexual suppression, </w:t>
-      </w:r>
-      <w:r>
-        <w:t>in which</w:t>
-      </w:r>
-      <w:r>
-        <w:t xml:space="preserve"> Wilde tempered suggestive and erotic language in the dialogue between the story’s main characters</w:t>
-      </w:r>
-      <w:r>
-        <w:t xml:space="preserve"> so that the it could pass the censors</w:t>
-      </w:r>
-      <w:r>
-        <w:t xml:space="preserve">. Using the TEI to surface the subtle codes of </w:t>
-      </w:r>
-      <w:r>
-        <w:t>Wilde’s</w:t>
-      </w:r>
-      <w:r>
-        <w:t xml:space="preserve"> revised dialogue, t</w:t>
-      </w:r>
-      <w:r>
-        <w:t xml:space="preserve">his strategy </w:t>
-      </w:r>
-      <w:r>
-        <w:t xml:space="preserve">allows researchers </w:t>
-      </w:r>
-      <w:r>
-        <w:t>to</w:t>
-      </w:r>
-      <w:r>
-        <w:t xml:space="preserve"> delineate irreconcilable interpretations of language choices in </w:t>
-      </w:r>
-      <w:r>
-        <w:t xml:space="preserve">his </w:t>
-      </w:r>
-      <w:r>
-        <w:t xml:space="preserve">revision without knowing or resolving </w:t>
-      </w:r>
-      <w:r>
-        <w:t>his</w:t>
-      </w:r>
-      <w:r>
-        <w:t xml:space="preserve"> ultimate intentions. It is, in other words, a method that surfaces the contours, but not the content, of what cannot be recovered. </w:t>
-      </w:r>
-      <w:r>
-        <w:t>The chapter ends</w:t>
-      </w:r>
-      <w:r>
-        <w:t xml:space="preserve"> with a meditation on Wilde's own position of privilege as an editor of his own text, </w:t>
-      </w:r>
-      <w:r>
-        <w:t>as an</w:t>
-      </w:r>
-      <w:r>
-        <w:t xml:space="preserve"> execut</w:t>
-      </w:r>
-      <w:r>
-        <w:t xml:space="preserve">or of </w:t>
-      </w:r>
-      <w:r>
-        <w:t>his own censorship. The privileges of his particular identity position exert a</w:t>
-      </w:r>
-      <w:r>
-        <w:t xml:space="preserve"> subtle</w:t>
-      </w:r>
-      <w:r>
-        <w:t xml:space="preserve"> layer of control in his text, to show that even the most strategic forms of inclusion are not </w:t>
-      </w:r>
-      <w:r>
-        <w:t xml:space="preserve">always </w:t>
-      </w:r>
-      <w:r>
-        <w:t>enough to challenge systems of power.</w:t>
+        <w:t>on</w:t>
+      </w:r>
+      <w:r>
+        <w:t xml:space="preserve"> the experience of growing up in the Mexico-Texas border. </w:t>
+      </w:r>
+      <w:r>
+        <w:t xml:space="preserve">Drawing from the </w:t>
+      </w:r>
+      <w:proofErr w:type="gramStart"/>
+      <w:r>
+        <w:t>borderlands</w:t>
+      </w:r>
+      <w:proofErr w:type="gramEnd"/>
+      <w:r>
+        <w:t xml:space="preserve"> concepts of land return and the vernacular practice of code-switching, the toggling between multiple Mexican and Texan dialects of Spanish and English, this</w:t>
+      </w:r>
+      <w:r>
+        <w:t xml:space="preserve"> chapter explores how </w:t>
+      </w:r>
+      <w:r>
+        <w:t xml:space="preserve">these concepts </w:t>
+      </w:r>
+      <w:r>
+        <w:t xml:space="preserve">enable a re-orientation </w:t>
+      </w:r>
+      <w:r>
+        <w:t>of the</w:t>
+      </w:r>
+      <w:r>
+        <w:t xml:space="preserve"> notion of</w:t>
+      </w:r>
+      <w:r>
+        <w:t xml:space="preserve"> capture, particularly text capture. It uses </w:t>
+      </w:r>
+      <w:r>
+        <w:rPr>
+          <w:rFonts w:cs="Times New Roman"/>
+        </w:rPr>
+        <w:t xml:space="preserve">these </w:t>
+      </w:r>
+      <w:r>
+        <w:t>theorizations</w:t>
+      </w:r>
+      <w:r>
+        <w:t xml:space="preserve"> a basis for </w:t>
+      </w:r>
+      <w:r>
+        <w:t xml:space="preserve">devising </w:t>
+      </w:r>
+      <w:r>
+        <w:t xml:space="preserve">web scraping protocols </w:t>
+      </w:r>
+      <w:r>
+        <w:t xml:space="preserve">that circumvent detection to capture text data about migrant and trans policies in the United States—data in the form of legislative documents and official proceedings. These web scraping protocols re-take what is nominally publicly accessible text data to open up the language within for interpretation and re-appropriation. </w:t>
+      </w:r>
+      <w:r>
+        <w:t>As the first chapter of the book, this chapter sets the stage for thinking about language</w:t>
+      </w:r>
+      <w:r>
+        <w:t xml:space="preserve">, like digital processes, </w:t>
+      </w:r>
+      <w:r>
+        <w:t>as a kind of tool, as something which can be taken, appropriated, and co-opted toward various uses. If co-option is inevitable, the question becomes</w:t>
+      </w:r>
+      <w:r>
+        <w:t xml:space="preserve"> not how to prevent it, but </w:t>
+      </w:r>
+      <w:r>
+        <w:t xml:space="preserve">how to develop practices </w:t>
+      </w:r>
+      <w:r>
+        <w:t xml:space="preserve">of resilience and </w:t>
+      </w:r>
+      <w:r>
+        <w:t xml:space="preserve">resistance. </w:t>
       </w:r>
     </w:p>
     <w:p>
@@ -2585,339 +2928,299 @@
         <w:ind w:firstLine="709"/>
       </w:pPr>
       <w:r>
-        <w:t xml:space="preserve">Moving from foundational processes like </w:t>
-      </w:r>
-      <w:r>
-        <w:t>counting</w:t>
-      </w:r>
-      <w:r>
-        <w:t xml:space="preserve"> and </w:t>
-      </w:r>
-      <w:r>
-        <w:t>tagging</w:t>
-      </w:r>
-      <w:r>
-        <w:t xml:space="preserve"> text, the second half of the book turns to more complex processes of </w:t>
-      </w:r>
-      <w:r>
-        <w:t>text display and generation</w:t>
-      </w:r>
-      <w:r>
-        <w:t xml:space="preserve">. Chapter Three, </w:t>
+        <w:t xml:space="preserve">Moving from text capture, Chapter Two, </w:t>
       </w:r>
       <w:r>
         <w:t>“</w:t>
       </w:r>
       <w:r>
-        <w:t>Text Display,</w:t>
+        <w:t>Text Analysis,</w:t>
       </w:r>
       <w:r>
         <w:t>”</w:t>
       </w:r>
       <w:r>
-        <w:t xml:space="preserve"> examines the computing </w:t>
+        <w:t xml:space="preserve"> explores</w:t>
+      </w:r>
+      <w:r>
+        <w:t xml:space="preserve"> the constraint of “iteration” which drives quantitative text analysis practices</w:t>
+      </w:r>
+      <w:r>
+        <w:t xml:space="preserve">. </w:t>
+      </w:r>
+      <w:r>
+        <w:t xml:space="preserve">It begins </w:t>
+      </w:r>
+      <w:r>
+        <w:t xml:space="preserve">with the most basic operation </w:t>
+      </w:r>
+      <w:r>
+        <w:lastRenderedPageBreak/>
+        <w:t xml:space="preserve">in text analysis, which is compiling word </w:t>
+      </w:r>
+      <w:r>
+        <w:t>frequencies</w:t>
+      </w:r>
+      <w:r>
+        <w:t xml:space="preserve"> through counting words and their contexts. In order to obtain accurate word counts, a text must first be </w:t>
       </w:r>
       <w:r>
         <w:t>“</w:t>
       </w:r>
       <w:r>
-        <w:t>stack,</w:t>
+        <w:t>cleaned</w:t>
       </w:r>
       <w:r>
         <w:t>”</w:t>
       </w:r>
       <w:r>
-        <w:t xml:space="preserve"> the layers of software that transport data from its storage in the hard drive to the screen display. In order for the stack to operate efficiently, coding instructions (</w:t>
-      </w:r>
-      <w:r>
-        <w:t xml:space="preserve">i.e. </w:t>
-      </w:r>
-      <w:r>
-        <w:t xml:space="preserve">the program code), must be separated from its execution, from </w:t>
-      </w:r>
-      <w:r>
-        <w:t xml:space="preserve">when the </w:t>
-      </w:r>
-      <w:r>
-        <w:t>program</w:t>
-      </w:r>
-      <w:r>
-        <w:t xml:space="preserve"> is actively running. </w:t>
-      </w:r>
-      <w:r>
-        <w:t xml:space="preserve">This environment creates an ontological state of displacement where electronic </w:t>
-      </w:r>
-      <w:r>
-        <w:t>processing always</w:t>
-      </w:r>
-      <w:r>
-        <w:t xml:space="preserve"> occurs at a level of remove</w:t>
-      </w:r>
-      <w:r>
-        <w:t xml:space="preserve"> from </w:t>
-      </w:r>
-      <w:r>
-        <w:t>where it appears to be</w:t>
+        <w:t xml:space="preserve"> or standardized</w:t>
+      </w:r>
+      <w:r>
+        <w:t xml:space="preserve">, so that textual details like pronouns, capital letters, and word endings do not skew or misrepresent the word frequencies. </w:t>
+      </w:r>
+      <w:r>
+        <w:t>These textual elements, which convey subtle</w:t>
+      </w:r>
+      <w:r>
+        <w:t xml:space="preserve"> meanings and </w:t>
+      </w:r>
+      <w:r>
+        <w:t>contrasts</w:t>
+      </w:r>
+      <w:r>
+        <w:t>, are removed one by one</w:t>
+      </w:r>
+      <w:r>
+        <w:t xml:space="preserve"> </w:t>
+      </w:r>
+      <w:r>
+        <w:t xml:space="preserve">in a </w:t>
+      </w:r>
+      <w:r>
+        <w:t>repetitive</w:t>
+      </w:r>
+      <w:r>
+        <w:t xml:space="preserve"> process</w:t>
+      </w:r>
+      <w:r>
+        <w:t xml:space="preserve"> that is known </w:t>
+      </w:r>
+      <w:r>
+        <w:t xml:space="preserve">in programming languages as </w:t>
+      </w:r>
+      <w:r>
+        <w:t>“iteration</w:t>
+      </w:r>
+      <w:r>
+        <w:t>.</w:t>
+      </w:r>
+      <w:r>
+        <w:t>”</w:t>
+      </w:r>
+      <w:r>
+        <w:t xml:space="preserve"> </w:t>
+      </w:r>
+      <w:r>
+        <w:t xml:space="preserve">To push against this reductive mechanism, </w:t>
+      </w:r>
+      <w:r>
+        <w:t xml:space="preserve">which transforms each word into a standardized, computable format, </w:t>
+      </w:r>
+      <w:r>
+        <w:t>this chapter turns to</w:t>
+      </w:r>
+      <w:r>
+        <w:t xml:space="preserve"> Judith Butler's </w:t>
+      </w:r>
+      <w:r>
+        <w:t xml:space="preserve">theory of gender peformativity. </w:t>
+      </w:r>
+      <w:r>
+        <w:t>Similarly to text analysis</w:t>
+      </w:r>
+      <w:r>
+        <w:t>,</w:t>
+      </w:r>
+      <w:r>
+        <w:t xml:space="preserve"> gender performativity is based on </w:t>
+      </w:r>
+      <w:r>
+        <w:t>a</w:t>
+      </w:r>
+      <w:r>
+        <w:t xml:space="preserve"> cyclical</w:t>
+      </w:r>
+      <w:r>
+        <w:t xml:space="preserve"> operation</w:t>
+      </w:r>
+      <w:r>
+        <w:t>, which Butler calls “iterativity,”</w:t>
+      </w:r>
+      <w:r>
+        <w:t xml:space="preserve"> that repeat</w:t>
+      </w:r>
+      <w:r>
+        <w:t>s</w:t>
+      </w:r>
+      <w:r>
+        <w:t xml:space="preserve"> </w:t>
+      </w:r>
+      <w:r>
+        <w:t>a</w:t>
+      </w:r>
+      <w:r>
+        <w:t xml:space="preserve"> specific series of actions</w:t>
+      </w:r>
+      <w:r>
+        <w:t xml:space="preserve"> with the effect of dismantling </w:t>
+      </w:r>
+      <w:r>
+        <w:t xml:space="preserve">its </w:t>
+      </w:r>
+      <w:r>
+        <w:t>entrenched</w:t>
+      </w:r>
+      <w:r>
+        <w:t xml:space="preserve"> meanings</w:t>
+      </w:r>
+      <w:r>
+        <w:t>.</w:t>
+      </w:r>
+      <w:r>
+        <w:t xml:space="preserve"> </w:t>
+      </w:r>
+      <w:r>
+        <w:t>The chapter</w:t>
+      </w:r>
+      <w:r>
+        <w:t xml:space="preserve"> then take</w:t>
+      </w:r>
+      <w:r>
+        <w:t>s</w:t>
+      </w:r>
+      <w:r>
+        <w:t xml:space="preserve"> gender performativity</w:t>
+      </w:r>
+      <w:r>
+        <w:t xml:space="preserve"> </w:t>
+      </w:r>
+      <w:r>
+        <w:t>into a new text analysis pra</w:t>
+      </w:r>
+      <w:r>
+        <w:t>c</w:t>
+      </w:r>
+      <w:r>
+        <w:t xml:space="preserve">tice to study gender forms in Virginia Woolf's novel, </w:t>
+      </w:r>
+      <w:r>
+        <w:rPr>
+          <w:rStyle w:val="Emphasis"/>
+        </w:rPr>
+        <w:t>Orlando: A Biography</w:t>
+      </w:r>
+      <w:r>
+        <w:t xml:space="preserve"> (1928). Butler's understanding of </w:t>
+      </w:r>
+      <w:r>
+        <w:t>iterativity</w:t>
+      </w:r>
+      <w:r>
+        <w:t xml:space="preserve"> </w:t>
+      </w:r>
+      <w:r>
+        <w:t>introduce</w:t>
+      </w:r>
+      <w:r>
+        <w:t>s</w:t>
+      </w:r>
+      <w:r>
+        <w:t xml:space="preserve"> randomness </w:t>
+      </w:r>
+      <w:r>
+        <w:t xml:space="preserve">into the </w:t>
+      </w:r>
+      <w:r>
+        <w:t xml:space="preserve">rigid and repetitive </w:t>
+      </w:r>
+      <w:r>
+        <w:t>text analysis process</w:t>
+      </w:r>
+      <w:r>
+        <w:t>,</w:t>
+      </w:r>
+      <w:r>
+        <w:t xml:space="preserve"> </w:t>
+      </w:r>
+      <w:r>
+        <w:t>open</w:t>
+      </w:r>
+      <w:r>
+        <w:t>ing</w:t>
+      </w:r>
+      <w:r>
+        <w:t xml:space="preserve"> </w:t>
+      </w:r>
+      <w:r>
+        <w:t>the potential for re-signifying gender terms and creating new associations in W</w:t>
+      </w:r>
+      <w:r>
+        <w:t>oolf’s</w:t>
+      </w:r>
+      <w:r>
+        <w:t xml:space="preserve"> novel</w:t>
       </w:r>
       <w:r>
         <w:t xml:space="preserve">. </w:t>
       </w:r>
       <w:r>
-        <w:t>Over</w:t>
-      </w:r>
-      <w:r>
-        <w:t xml:space="preserve"> </w:t>
-      </w:r>
-      <w:r>
-        <w:t>each layer of the stack</w:t>
-      </w:r>
-      <w:r>
-        <w:t>,</w:t>
-      </w:r>
-      <w:r>
-        <w:t xml:space="preserve"> </w:t>
-      </w:r>
-      <w:r>
-        <w:t xml:space="preserve">this sense of displacement accumulates </w:t>
-      </w:r>
-      <w:r>
-        <w:t>to</w:t>
-      </w:r>
-      <w:r>
-        <w:t xml:space="preserve"> give </w:t>
-      </w:r>
-      <w:r>
-        <w:t>the</w:t>
-      </w:r>
-      <w:r>
-        <w:t xml:space="preserve"> </w:t>
-      </w:r>
-      <w:r>
-        <w:t xml:space="preserve">final </w:t>
-      </w:r>
-      <w:r>
-        <w:t xml:space="preserve">illusion </w:t>
-      </w:r>
-      <w:r>
-        <w:t xml:space="preserve">of </w:t>
-      </w:r>
-      <w:r>
-        <w:t xml:space="preserve">objects </w:t>
-      </w:r>
-      <w:r>
-        <w:t xml:space="preserve">on the screen </w:t>
-      </w:r>
-      <w:r>
-        <w:t xml:space="preserve">that are </w:t>
-      </w:r>
-      <w:r>
-        <w:t>immaterial and unanchored from their physical manifestations on hard drives and processors</w:t>
-      </w:r>
-      <w:r>
-        <w:t xml:space="preserve">. To read materiality back into the stack, </w:t>
-      </w:r>
-      <w:r>
-        <w:t>the chapter</w:t>
-      </w:r>
-      <w:r>
-        <w:t xml:space="preserve"> draw</w:t>
-      </w:r>
-      <w:r>
-        <w:t>s</w:t>
-      </w:r>
-      <w:r>
-        <w:t xml:space="preserve"> from two seemingly unrelated fields, Media Archaeology</w:t>
-      </w:r>
-      <w:r>
-        <w:t xml:space="preserve"> Studies</w:t>
-      </w:r>
-      <w:r>
-        <w:t xml:space="preserve"> and Black Feminist Studies, both which offer robust methodologies for </w:t>
-      </w:r>
-      <w:proofErr w:type="spellStart"/>
-      <w:r>
-        <w:lastRenderedPageBreak/>
-        <w:t>analyzing</w:t>
-      </w:r>
-      <w:proofErr w:type="spellEnd"/>
-      <w:r>
-        <w:t xml:space="preserve"> the</w:t>
-      </w:r>
-      <w:r>
-        <w:t xml:space="preserve"> physical and </w:t>
-      </w:r>
-      <w:r>
-        <w:t>“</w:t>
-      </w:r>
-      <w:r>
-        <w:t>fleshy</w:t>
-      </w:r>
-      <w:r>
-        <w:t>”</w:t>
-      </w:r>
-      <w:r>
-        <w:t xml:space="preserve"> dimensions of symbolic processes. </w:t>
-      </w:r>
-      <w:r>
-        <w:t>According</w:t>
-      </w:r>
-      <w:r>
-        <w:t xml:space="preserve"> to Black Feminist Studies, for example, w</w:t>
-      </w:r>
-      <w:r>
-        <w:t xml:space="preserve">hen access to deeper, material processes is foreclosed, </w:t>
-      </w:r>
-      <w:r>
-        <w:t xml:space="preserve">opportunities </w:t>
-      </w:r>
-      <w:r>
-        <w:t>emerge for thinking</w:t>
-      </w:r>
-      <w:r>
-        <w:t xml:space="preserve"> </w:t>
-      </w:r>
-      <w:r>
-        <w:t>with</w:t>
-      </w:r>
-      <w:r>
-        <w:t xml:space="preserve"> the</w:t>
-      </w:r>
-      <w:r>
-        <w:t xml:space="preserve"> surface</w:t>
-      </w:r>
-      <w:r>
-        <w:t xml:space="preserve"> and its effects.</w:t>
-      </w:r>
-      <w:r>
-        <w:t xml:space="preserve"> </w:t>
-      </w:r>
-      <w:r>
-        <w:t xml:space="preserve">The chapter then takes these theories to </w:t>
-      </w:r>
-      <w:proofErr w:type="spellStart"/>
-      <w:r>
-        <w:t>analyze</w:t>
-      </w:r>
-      <w:proofErr w:type="spellEnd"/>
-      <w:r>
-        <w:t xml:space="preserve"> two works in parallel,</w:t>
-      </w:r>
-      <w:r>
-        <w:t xml:space="preserve"> </w:t>
-      </w:r>
-      <w:r>
-        <w:t>a</w:t>
-      </w:r>
-      <w:r>
-        <w:t xml:space="preserve"> </w:t>
-      </w:r>
-      <w:r>
-        <w:t>science fiction</w:t>
-      </w:r>
-      <w:r>
-        <w:t xml:space="preserve"> novel by</w:t>
-      </w:r>
-      <w:r>
-        <w:t xml:space="preserve"> </w:t>
-      </w:r>
-      <w:r>
-        <w:t>Octavia Butler</w:t>
-      </w:r>
-      <w:r>
-        <w:t>’</w:t>
-      </w:r>
-      <w:r>
-        <w:t>s</w:t>
-      </w:r>
-      <w:r>
-        <w:t xml:space="preserve"> novel,</w:t>
-      </w:r>
-      <w:r>
-        <w:t xml:space="preserve"> </w:t>
-      </w:r>
-      <w:r>
-        <w:rPr>
-          <w:rStyle w:val="Emphasis"/>
-        </w:rPr>
-        <w:t>Dawn</w:t>
-      </w:r>
-      <w:r>
-        <w:t xml:space="preserve"> (1987),</w:t>
-      </w:r>
-      <w:r>
-        <w:t xml:space="preserve"> alongside</w:t>
-      </w:r>
-      <w:r>
-        <w:t xml:space="preserve"> an early example of electronic fiction, </w:t>
-      </w:r>
-      <w:proofErr w:type="spellStart"/>
-      <w:r>
-        <w:rPr>
-          <w:rStyle w:val="Emphasis"/>
-        </w:rPr>
-        <w:t>skinonskinonskin</w:t>
-      </w:r>
-      <w:proofErr w:type="spellEnd"/>
-      <w:r>
-        <w:t xml:space="preserve">, by </w:t>
-      </w:r>
-      <w:proofErr w:type="spellStart"/>
-      <w:r>
-        <w:t>Aureia</w:t>
-      </w:r>
-      <w:proofErr w:type="spellEnd"/>
-      <w:r>
-        <w:t xml:space="preserve"> Harvey and Michaël Samyn, (1999). These two pieces, one print and another electronic, both explore the collision of material and immaterial forms</w:t>
-      </w:r>
-      <w:r>
-        <w:t xml:space="preserve">, </w:t>
-      </w:r>
-      <w:r>
-        <w:t>particularly</w:t>
-      </w:r>
-      <w:r>
-        <w:t xml:space="preserve"> as they relate to the themes of sexual desire and intimacy.</w:t>
-      </w:r>
-      <w:r>
-        <w:t xml:space="preserve"> Reading these works through one another, </w:t>
-      </w:r>
-      <w:r>
-        <w:t>the chapter</w:t>
-      </w:r>
-      <w:r>
-        <w:t xml:space="preserve"> show</w:t>
-      </w:r>
-      <w:r>
-        <w:t>s</w:t>
-      </w:r>
-      <w:r>
-        <w:t xml:space="preserve"> how </w:t>
-      </w:r>
-      <w:r>
-        <w:t xml:space="preserve">the </w:t>
-      </w:r>
-      <w:r>
-        <w:t xml:space="preserve">program code of the electronic piece, </w:t>
-      </w:r>
-      <w:proofErr w:type="spellStart"/>
-      <w:r>
-        <w:rPr>
-          <w:rStyle w:val="Emphasis"/>
-        </w:rPr>
-        <w:t>skinonskinonskin</w:t>
-      </w:r>
-      <w:proofErr w:type="spellEnd"/>
-      <w:r>
-        <w:t xml:space="preserve">, displays screen effects that, while apparently disconnected from </w:t>
-      </w:r>
-      <w:r>
-        <w:t>its</w:t>
-      </w:r>
-      <w:r>
-        <w:t xml:space="preserve"> underlying computational processing, surface a sense of physical intimacy within the stack.</w:t>
-      </w:r>
-      <w:r>
-        <w:t xml:space="preserve"> </w:t>
+        <w:t xml:space="preserve">The </w:t>
+      </w:r>
+      <w:r>
+        <w:t xml:space="preserve">chapter </w:t>
+      </w:r>
+      <w:r>
+        <w:t xml:space="preserve">closes </w:t>
+      </w:r>
+      <w:r>
+        <w:t xml:space="preserve">with some recent critiques of </w:t>
+      </w:r>
+      <w:r>
+        <w:t>g</w:t>
+      </w:r>
+      <w:r>
+        <w:t xml:space="preserve">ender </w:t>
+      </w:r>
+      <w:r>
+        <w:t>p</w:t>
+      </w:r>
+      <w:r>
+        <w:t>erformativity and its limitations as a discursive method</w:t>
+      </w:r>
+      <w:r>
+        <w:t>—</w:t>
+      </w:r>
+      <w:r>
+        <w:t xml:space="preserve">a problem </w:t>
+      </w:r>
+      <w:r>
+        <w:t xml:space="preserve">that the </w:t>
+      </w:r>
+      <w:r>
+        <w:t>final chapter</w:t>
+      </w:r>
+      <w:r>
+        <w:t xml:space="preserve"> addresses </w:t>
+      </w:r>
+      <w:r>
+        <w:t>from</w:t>
+      </w:r>
+      <w:r>
+        <w:t xml:space="preserve"> recent perspectives in Trans Studies</w:t>
+      </w:r>
+      <w:r>
+        <w:t xml:space="preserve">. </w:t>
       </w:r>
     </w:p>
     <w:p>
@@ -2927,404 +3230,274 @@
         <w:ind w:firstLine="709"/>
       </w:pPr>
       <w:r>
-        <w:t xml:space="preserve">The </w:t>
-      </w:r>
-      <w:r>
-        <w:t>f</w:t>
-      </w:r>
-      <w:r>
-        <w:t>ourth and final chapter, “Text Generation,” examines machine learning processes used to generate text. This chapter traces the steps behind</w:t>
-      </w:r>
-      <w:r>
-        <w:t xml:space="preserve"> machine learning processes, specifically the training process for Large Language Models (LLMs), </w:t>
-      </w:r>
-      <w:r>
-        <w:t xml:space="preserve">to explore how </w:t>
-      </w:r>
-      <w:r>
-        <w:t>they</w:t>
-      </w:r>
-      <w:r>
-        <w:t xml:space="preserve"> transform word meaning into computational form. </w:t>
-      </w:r>
-      <w:r>
-        <w:t xml:space="preserve">Similarly to text analysis, LLMs </w:t>
-      </w:r>
+        <w:t xml:space="preserve">Moving from text analysis to text encoding, Chapter </w:t>
+      </w:r>
+      <w:r>
+        <w:t>Three</w:t>
+      </w:r>
+      <w:r>
+        <w:t xml:space="preserve">, </w:t>
+      </w:r>
+      <w:r>
+        <w:t>“</w:t>
+      </w:r>
+      <w:r>
+        <w:t>Text Preservation</w:t>
+      </w:r>
+      <w:r>
+        <w:t>”</w:t>
+      </w:r>
+      <w:r>
+        <w:t xml:space="preserve"> examines </w:t>
+      </w:r>
+      <w:r>
+        <w:t xml:space="preserve">the constraint of “containment” and how it structures how text data is tagged and preserved in digital formats. It </w:t>
+      </w:r>
+      <w:proofErr w:type="gramStart"/>
       <w:r>
         <w:t>take</w:t>
       </w:r>
-      <w:r>
-        <w:t xml:space="preserve"> a</w:t>
-      </w:r>
-      <w:r>
-        <w:t xml:space="preserve">n individual </w:t>
-      </w:r>
-      <w:r>
-        <w:t>word</w:t>
-      </w:r>
-      <w:r>
-        <w:t>’</w:t>
-      </w:r>
-      <w:r>
-        <w:t xml:space="preserve">s context </w:t>
+      <w:proofErr w:type="gramEnd"/>
+      <w:r>
+        <w:t xml:space="preserve"> up th</w:t>
+      </w:r>
+      <w:r>
+        <w:t>e Text Encoding Init</w:t>
+      </w:r>
+      <w:r>
+        <w:t>i</w:t>
+      </w:r>
+      <w:r>
+        <w:t xml:space="preserve">ative (TEI), a </w:t>
+      </w:r>
+      <w:r>
+        <w:t>popular standard</w:t>
+      </w:r>
+      <w:r>
+        <w:t xml:space="preserve">, or </w:t>
+      </w:r>
+      <w:r>
+        <w:t xml:space="preserve">a set of </w:t>
+      </w:r>
+      <w:r>
+        <w:t>rules</w:t>
+      </w:r>
+      <w:r>
+        <w:t>,</w:t>
+      </w:r>
+      <w:r>
+        <w:t xml:space="preserve"> </w:t>
+      </w:r>
+      <w:r>
+        <w:t xml:space="preserve">for tagging, or </w:t>
+      </w:r>
+      <w:r>
+        <w:t>“</w:t>
+      </w:r>
+      <w:r>
+        <w:t>encoding,</w:t>
+      </w:r>
+      <w:r>
+        <w:t>”</w:t>
+      </w:r>
+      <w:r>
+        <w:t xml:space="preserve"> </w:t>
+      </w:r>
+      <w:r>
+        <w:t>print</w:t>
+      </w:r>
+      <w:r>
+        <w:t>ed</w:t>
+      </w:r>
+      <w:r>
+        <w:t xml:space="preserve"> text and manuscripts </w:t>
+      </w:r>
+      <w:r>
+        <w:t>into electronic formats</w:t>
+      </w:r>
+      <w:r>
+        <w:t xml:space="preserve">. The TEI requires that text be sorted into a rigid, hierarchical </w:t>
+      </w:r>
+      <w:r>
+        <w:t>structure</w:t>
+      </w:r>
+      <w:r>
+        <w:t>, where inner</w:t>
+      </w:r>
+      <w:r>
+        <w:t>,</w:t>
+      </w:r>
+      <w:r>
+        <w:t xml:space="preserve"> </w:t>
+      </w:r>
+      <w:r>
+        <w:t>“</w:t>
+      </w:r>
+      <w:r>
+        <w:t>child</w:t>
+      </w:r>
+      <w:r>
+        <w:t>”</w:t>
+      </w:r>
+      <w:r>
+        <w:t xml:space="preserve"> elements are bound within their outer</w:t>
+      </w:r>
+      <w:r>
+        <w:t>,</w:t>
+      </w:r>
+      <w:r>
+        <w:t xml:space="preserve"> </w:t>
+      </w:r>
+      <w:r>
+        <w:t>“</w:t>
+      </w:r>
+      <w:r>
+        <w:t>parent</w:t>
+      </w:r>
+      <w:r>
+        <w:t>”</w:t>
+      </w:r>
+      <w:r>
+        <w:t xml:space="preserve"> element.</w:t>
+      </w:r>
+      <w:r>
+        <w:t xml:space="preserve"> Syntactic and semantic forms of language are thus fixed and disambiguated into discrete elements within an ordered hierarchy. </w:t>
+      </w:r>
+      <w:r>
+        <w:t xml:space="preserve">To resist this top-down </w:t>
+      </w:r>
+      <w:r>
+        <w:t>containment of data,</w:t>
+      </w:r>
+      <w:r>
+        <w:t xml:space="preserve"> </w:t>
+      </w:r>
+      <w:r>
+        <w:t>in the TEI</w:t>
+      </w:r>
+      <w:r>
+        <w:t xml:space="preserve">, </w:t>
+      </w:r>
+      <w:r>
+        <w:t>the chapter</w:t>
+      </w:r>
+      <w:r>
+        <w:t xml:space="preserve"> turn</w:t>
+      </w:r>
+      <w:r>
+        <w:t>s</w:t>
+      </w:r>
+      <w:r>
+        <w:t xml:space="preserve"> to the strategy of disidentification, theorized by Queer of Color Critique scholar José Esteban Muñoz. Disidentification, which is a method for re-appropriating dominant codes, offers a useful heuristic for grappling with the rigid boundaries </w:t>
+      </w:r>
+      <w:r>
+        <w:t xml:space="preserve">and protocols </w:t>
+      </w:r>
+      <w:r>
+        <w:t xml:space="preserve">of the TEI. </w:t>
+      </w:r>
+      <w:r>
+        <w:t>The chapter</w:t>
+      </w:r>
+      <w:r>
+        <w:t xml:space="preserve"> </w:t>
+      </w:r>
+      <w:r>
+        <w:t>appl</w:t>
+      </w:r>
+      <w:r>
+        <w:t>ies</w:t>
+      </w:r>
+      <w:r>
+        <w:t xml:space="preserve"> this strategy to encode the revisions that Oscar Wilde </w:t>
+      </w:r>
+      <w:r>
+        <w:lastRenderedPageBreak/>
+        <w:t xml:space="preserve">made to his novel, </w:t>
+      </w:r>
+      <w:r>
+        <w:rPr>
+          <w:rStyle w:val="Emphasis"/>
+        </w:rPr>
+        <w:t>The Picture of Dorian Gray</w:t>
+      </w:r>
+      <w:r>
+        <w:t xml:space="preserve">, prior to its publication in 1890. </w:t>
+      </w:r>
+      <w:r>
+        <w:t xml:space="preserve">This manuscript reveals traces of homosexual suppression, </w:t>
+      </w:r>
+      <w:r>
+        <w:t>in which</w:t>
+      </w:r>
+      <w:r>
+        <w:t xml:space="preserve"> Wilde tempered suggestive and erotic language in the dialogue between the story’s main characters</w:t>
+      </w:r>
+      <w:r>
+        <w:t xml:space="preserve"> so that the it could pass the censors</w:t>
+      </w:r>
+      <w:r>
+        <w:t xml:space="preserve">. Using the TEI to surface the subtle codes of </w:t>
+      </w:r>
+      <w:r>
+        <w:t>Wilde’s</w:t>
+      </w:r>
+      <w:r>
+        <w:t xml:space="preserve"> revised dialogue, t</w:t>
+      </w:r>
+      <w:r>
+        <w:t xml:space="preserve">his strategy </w:t>
+      </w:r>
+      <w:r>
+        <w:t xml:space="preserve">allows researchers </w:t>
       </w:r>
       <w:r>
         <w:t>to</w:t>
       </w:r>
       <w:r>
-        <w:t xml:space="preserve"> compile word frequencies for </w:t>
-      </w:r>
-      <w:r>
-        <w:t>that</w:t>
-      </w:r>
-      <w:r>
-        <w:t xml:space="preserve"> word. Unlike text analysis, however, these word frequencies are used in </w:t>
-      </w:r>
-      <w:r>
-        <w:rPr>
-          <w:i/>
-          <w:iCs/>
-        </w:rPr>
-        <w:t xml:space="preserve">predictive </w:t>
-      </w:r>
-      <w:r>
-        <w:t xml:space="preserve">processes, as part of algorithms that guess what text </w:t>
-      </w:r>
-      <w:r>
-        <w:t xml:space="preserve">should be </w:t>
-      </w:r>
-      <w:r>
-        <w:t>generate</w:t>
-      </w:r>
-      <w:r>
-        <w:t>d</w:t>
-      </w:r>
-      <w:r>
-        <w:t xml:space="preserve">, that is, which word </w:t>
-      </w:r>
-      <w:r>
-        <w:t>would most likely</w:t>
-      </w:r>
-      <w:r>
-        <w:t xml:space="preserve"> follow </w:t>
-      </w:r>
-      <w:r>
-        <w:t>another word</w:t>
-      </w:r>
-      <w:r>
-        <w:t xml:space="preserve"> based on previous patterns of word usage. In order to </w:t>
-      </w:r>
-      <w:r>
-        <w:t>predict words</w:t>
-      </w:r>
-      <w:r>
-        <w:t xml:space="preserve">, LLMs must create an aggregate representation of word meaning. This representation </w:t>
-      </w:r>
-      <w:r>
-        <w:t xml:space="preserve">contains a kind of </w:t>
-      </w:r>
-      <w:r>
-        <w:t xml:space="preserve">average, or </w:t>
-      </w:r>
-      <w:r>
-        <w:t>approximate</w:t>
-      </w:r>
-      <w:r>
-        <w:t xml:space="preserve">, </w:t>
-      </w:r>
-      <w:r>
-        <w:t>definition</w:t>
-      </w:r>
-      <w:r>
-        <w:t xml:space="preserve"> of the word based on its various usages. </w:t>
-      </w:r>
-      <w:r>
-        <w:t xml:space="preserve">This </w:t>
-      </w:r>
-      <w:r>
-        <w:t xml:space="preserve">process of </w:t>
-      </w:r>
-      <w:r>
-        <w:t>averag</w:t>
-      </w:r>
-      <w:r>
-        <w:t>ing</w:t>
-      </w:r>
-      <w:r>
-        <w:t xml:space="preserve"> or </w:t>
-      </w:r>
-      <w:r>
-        <w:t>approximating</w:t>
-      </w:r>
-      <w:r>
-        <w:t xml:space="preserve"> word patterns, </w:t>
-      </w:r>
-      <w:r>
-        <w:t xml:space="preserve">which </w:t>
-      </w:r>
-      <w:r>
-        <w:t>aims to</w:t>
-      </w:r>
-      <w:r>
-        <w:t xml:space="preserve"> </w:t>
-      </w:r>
-      <w:r>
-        <w:t>“</w:t>
-      </w:r>
-      <w:r>
-        <w:t>normalize</w:t>
-      </w:r>
-      <w:r>
-        <w:t>”</w:t>
-      </w:r>
-      <w:r>
-        <w:t xml:space="preserve"> </w:t>
-      </w:r>
-      <w:r>
-        <w:t xml:space="preserve">word meaning </w:t>
-      </w:r>
-      <w:r>
-        <w:t>across various examples</w:t>
-      </w:r>
-      <w:r>
-        <w:t xml:space="preserve"> of its usage</w:t>
-      </w:r>
-      <w:r>
-        <w:t xml:space="preserve">, </w:t>
-      </w:r>
-      <w:r>
-        <w:t xml:space="preserve">inspires the </w:t>
-      </w:r>
-      <w:r>
-        <w:t>study of</w:t>
-      </w:r>
-      <w:r>
-        <w:t xml:space="preserve"> </w:t>
-      </w:r>
-      <w:r>
-        <w:t xml:space="preserve">social </w:t>
-      </w:r>
-      <w:r>
-        <w:t>norm</w:t>
-      </w:r>
-      <w:r>
-        <w:t xml:space="preserve">s </w:t>
-      </w:r>
-      <w:r>
-        <w:t xml:space="preserve">in language. </w:t>
-      </w:r>
-      <w:r>
-        <w:t>The chapter</w:t>
-      </w:r>
-      <w:r>
-        <w:t xml:space="preserve"> </w:t>
-      </w:r>
-      <w:r>
-        <w:t>then uses LLMs to study</w:t>
-      </w:r>
-      <w:r>
-        <w:t xml:space="preserve"> these norms in a</w:t>
-      </w:r>
-      <w:r>
-        <w:t xml:space="preserve"> heterosexual, cisgendered context, </w:t>
-      </w:r>
-      <w:r>
-        <w:t>from the</w:t>
-      </w:r>
-      <w:r>
-        <w:t xml:space="preserve"> reality TV show, </w:t>
-      </w:r>
-      <w:r>
-        <w:rPr>
-          <w:rStyle w:val="Emphasis"/>
-        </w:rPr>
-        <w:t>Love is Blind</w:t>
-      </w:r>
-      <w:r>
-        <w:t xml:space="preserve">. </w:t>
-      </w:r>
-      <w:r>
-        <w:t xml:space="preserve">In this show, </w:t>
-      </w:r>
-      <w:r>
-        <w:t xml:space="preserve">heterosexual </w:t>
-      </w:r>
-      <w:r>
-        <w:t xml:space="preserve">participants are placed in a dating experiment </w:t>
-      </w:r>
-      <w:r>
-        <w:t xml:space="preserve">in which they </w:t>
-      </w:r>
-      <w:r>
-        <w:t>cannot</w:t>
-      </w:r>
-      <w:r>
-        <w:t xml:space="preserve"> see their dating partners until they have agreed to marry them. </w:t>
-      </w:r>
-      <w:r>
-        <w:t>Training a</w:t>
-      </w:r>
-      <w:r>
-        <w:t xml:space="preserve">n LLM </w:t>
-      </w:r>
-      <w:r>
-        <w:t xml:space="preserve">on the transcripts from the show, so that it </w:t>
-      </w:r>
-      <w:r>
-        <w:t>generates text that approximates the s</w:t>
-      </w:r>
-      <w:r>
-        <w:t>how participants</w:t>
-      </w:r>
-      <w:r>
-        <w:t>’ speech</w:t>
-      </w:r>
-      <w:r>
-        <w:t xml:space="preserve">, </w:t>
-      </w:r>
-      <w:r>
-        <w:t>the chapter</w:t>
-      </w:r>
-      <w:r>
-        <w:t xml:space="preserve"> pose</w:t>
-      </w:r>
-      <w:r>
-        <w:t>s</w:t>
-      </w:r>
-      <w:r>
-        <w:t xml:space="preserve"> questions about </w:t>
-      </w:r>
-      <w:r>
-        <w:t>the role of gender</w:t>
-      </w:r>
-      <w:r>
-        <w:t xml:space="preserve"> </w:t>
-      </w:r>
-      <w:r>
-        <w:lastRenderedPageBreak/>
-        <w:t xml:space="preserve">and </w:t>
-      </w:r>
-      <w:r>
-        <w:t xml:space="preserve">embodiment in </w:t>
-      </w:r>
-      <w:r>
-        <w:t xml:space="preserve">the “blind” </w:t>
-      </w:r>
-      <w:r>
-        <w:t>dating dynamic</w:t>
-      </w:r>
-      <w:r>
-        <w:t xml:space="preserve">. The </w:t>
-      </w:r>
-      <w:r>
-        <w:t>LLM’s</w:t>
-      </w:r>
-      <w:r>
-        <w:t xml:space="preserve"> responses reveal linguistic and affective patterns around the body which </w:t>
-      </w:r>
-      <w:r>
-        <w:t>not only characterize the</w:t>
-      </w:r>
-      <w:r>
-        <w:t xml:space="preserve"> normative investments from the show</w:t>
-      </w:r>
-      <w:r>
-        <w:t>, but also an experience of bodily dissonance due to the visual separation between the participants</w:t>
-      </w:r>
-      <w:r>
-        <w:t>.</w:t>
-      </w:r>
-      <w:r>
-        <w:t xml:space="preserve"> To read these experiences, the chapter draws from Trans Studies theorizing on the body and the </w:t>
-      </w:r>
-      <w:r>
-        <w:t xml:space="preserve">experience of bodily </w:t>
-      </w:r>
-      <w:r>
-        <w:t>disjunction, which often accompan</w:t>
-      </w:r>
-      <w:r>
-        <w:t>y</w:t>
-      </w:r>
-      <w:r>
-        <w:t xml:space="preserve"> feelings of dysphoria, in transition narratives.</w:t>
-      </w:r>
-      <w:r>
-        <w:t xml:space="preserve"> </w:t>
-      </w:r>
-      <w:r>
-        <w:t>It shows how t</w:t>
-      </w:r>
-      <w:r>
-        <w:t xml:space="preserve">he </w:t>
-      </w:r>
-      <w:r>
-        <w:t xml:space="preserve">participants in </w:t>
-      </w:r>
-      <w:r>
-        <w:rPr>
-          <w:rStyle w:val="Emphasis"/>
-        </w:rPr>
-        <w:t>Love Is Blind</w:t>
-      </w:r>
-      <w:r>
-        <w:t>—</w:t>
-      </w:r>
-      <w:r>
-        <w:t xml:space="preserve">while firmly anchored </w:t>
-      </w:r>
-      <w:r>
-        <w:t>to their</w:t>
-      </w:r>
-      <w:r>
-        <w:t xml:space="preserve"> </w:t>
-      </w:r>
-      <w:proofErr w:type="spellStart"/>
-      <w:r>
-        <w:t>cisnormative</w:t>
-      </w:r>
-      <w:proofErr w:type="spellEnd"/>
-      <w:r>
-        <w:t xml:space="preserve"> frameworks</w:t>
-      </w:r>
-      <w:r>
-        <w:t>—</w:t>
-      </w:r>
-      <w:r>
-        <w:t xml:space="preserve">experience a temporary form of </w:t>
-      </w:r>
-      <w:r>
-        <w:t xml:space="preserve">sensory disjunction that evokes </w:t>
-      </w:r>
-      <w:r>
-        <w:t xml:space="preserve">experiences from </w:t>
-      </w:r>
-      <w:r>
-        <w:t>trans narratives</w:t>
-      </w:r>
-      <w:r>
-        <w:t>. The chapter concludes that this analysis, which based on surfacing shared investments</w:t>
-      </w:r>
-      <w:r>
-        <w:t xml:space="preserve"> between identity groups</w:t>
-      </w:r>
-      <w:r>
-        <w:t>,</w:t>
-      </w:r>
-      <w:r>
-        <w:t xml:space="preserve"> offers ground</w:t>
-      </w:r>
-      <w:r>
-        <w:t>work</w:t>
-      </w:r>
-      <w:r>
-        <w:t xml:space="preserve"> for building solidarity across </w:t>
-      </w:r>
-      <w:r>
-        <w:t xml:space="preserve">even polarized </w:t>
-      </w:r>
-      <w:r>
-        <w:t>points of view.</w:t>
+        <w:t xml:space="preserve"> delineate irreconcilable interpretations of language choices in </w:t>
+      </w:r>
+      <w:r>
+        <w:t xml:space="preserve">his </w:t>
+      </w:r>
+      <w:r>
+        <w:t xml:space="preserve">revision without knowing or resolving </w:t>
+      </w:r>
+      <w:r>
+        <w:t>his</w:t>
+      </w:r>
+      <w:r>
+        <w:t xml:space="preserve"> ultimate intentions. It is, in other words, a method that surfaces the contours, but not the content, of what cannot be recovered. </w:t>
+      </w:r>
+      <w:r>
+        <w:t>The chapter ends</w:t>
+      </w:r>
+      <w:r>
+        <w:t xml:space="preserve"> with a meditation on Wilde's own position of privilege as an editor of his own text, </w:t>
+      </w:r>
+      <w:r>
+        <w:t>as an</w:t>
+      </w:r>
+      <w:r>
+        <w:t xml:space="preserve"> execut</w:t>
+      </w:r>
+      <w:r>
+        <w:t xml:space="preserve">or of </w:t>
+      </w:r>
+      <w:r>
+        <w:t>his own censorship. The privileges of his particular identity position exert a</w:t>
+      </w:r>
+      <w:r>
+        <w:t xml:space="preserve"> subtle</w:t>
+      </w:r>
+      <w:r>
+        <w:t xml:space="preserve"> layer of control in his text, to show that even the most strategic forms of inclusion are not </w:t>
+      </w:r>
+      <w:r>
+        <w:t xml:space="preserve">always </w:t>
+      </w:r>
+      <w:r>
+        <w:t>enough to challenge systems of power.</w:t>
       </w:r>
     </w:p>
     <w:p>
@@ -3334,7 +3507,326 @@
         <w:ind w:firstLine="709"/>
       </w:pPr>
       <w:r>
-        <w:t xml:space="preserve">As of December 2025, the four body chapters have each been drafted, and are in the process of undergoing revision. The introduction and the conclusion remain to be drafted. </w:t>
+        <w:t xml:space="preserve">Moving from foundational processes like </w:t>
+      </w:r>
+      <w:r>
+        <w:t>counting</w:t>
+      </w:r>
+      <w:r>
+        <w:t xml:space="preserve"> and </w:t>
+      </w:r>
+      <w:r>
+        <w:t>tagging</w:t>
+      </w:r>
+      <w:r>
+        <w:t xml:space="preserve"> text, the </w:t>
+      </w:r>
+      <w:r>
+        <w:t xml:space="preserve">final two chapters </w:t>
+      </w:r>
+      <w:r>
+        <w:t xml:space="preserve">of the book turns to more complex processes of </w:t>
+      </w:r>
+      <w:r>
+        <w:t>text display and generation</w:t>
+      </w:r>
+      <w:r>
+        <w:t xml:space="preserve">. Chapter </w:t>
+      </w:r>
+      <w:r>
+        <w:t>Four</w:t>
+      </w:r>
+      <w:r>
+        <w:t xml:space="preserve">, </w:t>
+      </w:r>
+      <w:r>
+        <w:t>“</w:t>
+      </w:r>
+      <w:r>
+        <w:t>Text Display,</w:t>
+      </w:r>
+      <w:r>
+        <w:t>”</w:t>
+      </w:r>
+      <w:r>
+        <w:t xml:space="preserve"> </w:t>
+      </w:r>
+      <w:r>
+        <w:t xml:space="preserve">takes up the constraint of “abstraction” within </w:t>
+      </w:r>
+      <w:r>
+        <w:t>the computing stack,</w:t>
+      </w:r>
+      <w:r>
+        <w:t xml:space="preserve"> that is,</w:t>
+      </w:r>
+      <w:r>
+        <w:t xml:space="preserve"> the layers of software that transport data from its storage in the hard drive to the screen display. In order for the stack to operate efficiently, coding instructions (</w:t>
+      </w:r>
+      <w:r>
+        <w:t xml:space="preserve">i.e. </w:t>
+      </w:r>
+      <w:r>
+        <w:t xml:space="preserve">the program code), must be separated from its execution, from </w:t>
+      </w:r>
+      <w:r>
+        <w:t xml:space="preserve">when the </w:t>
+      </w:r>
+      <w:r>
+        <w:t>program</w:t>
+      </w:r>
+      <w:r>
+        <w:t xml:space="preserve"> is actively running. </w:t>
+      </w:r>
+      <w:r>
+        <w:t xml:space="preserve">This environment creates an ontological state of displacement where electronic </w:t>
+      </w:r>
+      <w:r>
+        <w:t>processing always</w:t>
+      </w:r>
+      <w:r>
+        <w:t xml:space="preserve"> occurs at a level of remove</w:t>
+      </w:r>
+      <w:r>
+        <w:t xml:space="preserve"> from </w:t>
+      </w:r>
+      <w:r>
+        <w:t>where it appears to be</w:t>
+      </w:r>
+      <w:r>
+        <w:t xml:space="preserve">. </w:t>
+      </w:r>
+      <w:r>
+        <w:t>Over</w:t>
+      </w:r>
+      <w:r>
+        <w:t xml:space="preserve"> </w:t>
+      </w:r>
+      <w:r>
+        <w:t>each layer of the stack</w:t>
+      </w:r>
+      <w:r>
+        <w:t>,</w:t>
+      </w:r>
+      <w:r>
+        <w:t xml:space="preserve"> </w:t>
+      </w:r>
+      <w:r>
+        <w:t xml:space="preserve">this sense of displacement accumulates </w:t>
+      </w:r>
+      <w:r>
+        <w:t>to</w:t>
+      </w:r>
+      <w:r>
+        <w:t xml:space="preserve"> give </w:t>
+      </w:r>
+      <w:r>
+        <w:t>the</w:t>
+      </w:r>
+      <w:r>
+        <w:t xml:space="preserve"> </w:t>
+      </w:r>
+      <w:r>
+        <w:t xml:space="preserve">final </w:t>
+      </w:r>
+      <w:r>
+        <w:t xml:space="preserve">illusion </w:t>
+      </w:r>
+      <w:r>
+        <w:t xml:space="preserve">of </w:t>
+      </w:r>
+      <w:r>
+        <w:t xml:space="preserve">objects </w:t>
+      </w:r>
+      <w:r>
+        <w:t xml:space="preserve">on the screen </w:t>
+      </w:r>
+      <w:r>
+        <w:t xml:space="preserve">that are </w:t>
+      </w:r>
+      <w:r>
+        <w:t>immaterial and unanchored from their physical manifestations on hard drives and processors</w:t>
+      </w:r>
+      <w:r>
+        <w:t xml:space="preserve">. To read materiality back into the stack, </w:t>
+      </w:r>
+      <w:r>
+        <w:t>the chapter</w:t>
+      </w:r>
+      <w:r>
+        <w:t xml:space="preserve"> draw</w:t>
+      </w:r>
+      <w:r>
+        <w:t>s</w:t>
+      </w:r>
+      <w:r>
+        <w:t xml:space="preserve"> from two seemingly unrelated fields, Media Archaeology</w:t>
+      </w:r>
+      <w:r>
+        <w:t xml:space="preserve"> Studies</w:t>
+      </w:r>
+      <w:r>
+        <w:t xml:space="preserve"> and Black Feminist Studies, both which offer robust methodologies for </w:t>
+      </w:r>
+      <w:r>
+        <w:t>analyzing the</w:t>
+      </w:r>
+      <w:r>
+        <w:t xml:space="preserve"> physical and </w:t>
+      </w:r>
+      <w:r>
+        <w:t>“</w:t>
+      </w:r>
+      <w:r>
+        <w:t>fleshy</w:t>
+      </w:r>
+      <w:r>
+        <w:t>”</w:t>
+      </w:r>
+      <w:r>
+        <w:t xml:space="preserve"> dimensions of symbolic processes. </w:t>
+      </w:r>
+      <w:r>
+        <w:t>According</w:t>
+      </w:r>
+      <w:r>
+        <w:t xml:space="preserve"> to Black Feminist Studies, for example, w</w:t>
+      </w:r>
+      <w:r>
+        <w:t xml:space="preserve">hen access to deeper, material processes is foreclosed, </w:t>
+      </w:r>
+      <w:r>
+        <w:t xml:space="preserve">opportunities </w:t>
+      </w:r>
+      <w:r>
+        <w:t>emerge for thinking</w:t>
+      </w:r>
+      <w:r>
+        <w:t xml:space="preserve"> </w:t>
+      </w:r>
+      <w:r>
+        <w:t>with</w:t>
+      </w:r>
+      <w:r>
+        <w:t xml:space="preserve"> the</w:t>
+      </w:r>
+      <w:r>
+        <w:t xml:space="preserve"> surface</w:t>
+      </w:r>
+      <w:r>
+        <w:t xml:space="preserve"> and its effects.</w:t>
+      </w:r>
+      <w:r>
+        <w:t xml:space="preserve"> </w:t>
+      </w:r>
+      <w:r>
+        <w:t>The chapter then takes these theories to analyze two works in parallel,</w:t>
+      </w:r>
+      <w:r>
+        <w:t xml:space="preserve"> </w:t>
+      </w:r>
+      <w:r>
+        <w:t>a</w:t>
+      </w:r>
+      <w:r>
+        <w:t xml:space="preserve"> </w:t>
+      </w:r>
+      <w:r>
+        <w:t>science fiction</w:t>
+      </w:r>
+      <w:r>
+        <w:t xml:space="preserve"> novel by</w:t>
+      </w:r>
+      <w:r>
+        <w:t xml:space="preserve"> </w:t>
+      </w:r>
+      <w:r>
+        <w:t>Octavia Butler</w:t>
+      </w:r>
+      <w:r>
+        <w:t>’</w:t>
+      </w:r>
+      <w:r>
+        <w:t>s</w:t>
+      </w:r>
+      <w:r>
+        <w:t xml:space="preserve"> novel,</w:t>
+      </w:r>
+      <w:r>
+        <w:t xml:space="preserve"> </w:t>
+      </w:r>
+      <w:r>
+        <w:rPr>
+          <w:rStyle w:val="Emphasis"/>
+        </w:rPr>
+        <w:t>Dawn</w:t>
+      </w:r>
+      <w:r>
+        <w:t xml:space="preserve"> (1987),</w:t>
+      </w:r>
+      <w:r>
+        <w:t xml:space="preserve"> alongside</w:t>
+      </w:r>
+      <w:r>
+        <w:t xml:space="preserve"> an early example of electronic fiction, </w:t>
+      </w:r>
+      <w:r>
+        <w:rPr>
+          <w:rStyle w:val="Emphasis"/>
+        </w:rPr>
+        <w:lastRenderedPageBreak/>
+        <w:t>skinonskinonskin</w:t>
+      </w:r>
+      <w:r>
+        <w:t>, by Aureia Harvey and Michaël Samyn, (1999). These two pieces, one print and another electronic, both explore the collision of material and immaterial forms</w:t>
+      </w:r>
+      <w:r>
+        <w:t xml:space="preserve">, </w:t>
+      </w:r>
+      <w:r>
+        <w:t>particularly</w:t>
+      </w:r>
+      <w:r>
+        <w:t xml:space="preserve"> as they relate to the themes of sexual desire and intimacy.</w:t>
+      </w:r>
+      <w:r>
+        <w:t xml:space="preserve"> Reading these works through one another, </w:t>
+      </w:r>
+      <w:r>
+        <w:t>the chapter</w:t>
+      </w:r>
+      <w:r>
+        <w:t xml:space="preserve"> show</w:t>
+      </w:r>
+      <w:r>
+        <w:t>s</w:t>
+      </w:r>
+      <w:r>
+        <w:t xml:space="preserve"> how </w:t>
+      </w:r>
+      <w:r>
+        <w:t xml:space="preserve">the </w:t>
+      </w:r>
+      <w:r>
+        <w:t xml:space="preserve">program code of the electronic piece, </w:t>
+      </w:r>
+      <w:r>
+        <w:rPr>
+          <w:rStyle w:val="Emphasis"/>
+        </w:rPr>
+        <w:t>skinonskinonskin</w:t>
+      </w:r>
+      <w:r>
+        <w:t xml:space="preserve">, displays screen effects that, while apparently disconnected from </w:t>
+      </w:r>
+      <w:r>
+        <w:t>its</w:t>
+      </w:r>
+      <w:r>
+        <w:t xml:space="preserve"> underlying computational processing, surface a sense of physical intimacy within the stack.</w:t>
+      </w:r>
+      <w:r>
+        <w:t xml:space="preserve"> </w:t>
       </w:r>
     </w:p>
     <w:p>
@@ -3342,6 +3834,617 @@
         <w:pStyle w:val="Textbody"/>
         <w:spacing w:line="480" w:lineRule="auto"/>
         <w:ind w:firstLine="709"/>
+      </w:pPr>
+      <w:r>
+        <w:t xml:space="preserve">The </w:t>
+      </w:r>
+      <w:r>
+        <w:t>fifth</w:t>
+      </w:r>
+      <w:r>
+        <w:t xml:space="preserve"> and final chapter, “Text Generation,” </w:t>
+      </w:r>
+      <w:r>
+        <w:t xml:space="preserve">turns on the constraint of aggregation, which is used within </w:t>
+      </w:r>
+      <w:r>
+        <w:t>machine learning processes to generate text. This chapter traces the steps behind</w:t>
+      </w:r>
+      <w:r>
+        <w:t xml:space="preserve"> machine learning processes, specifically the training process for Large Language Models (LLMs), </w:t>
+      </w:r>
+      <w:r>
+        <w:t xml:space="preserve">to explore how </w:t>
+      </w:r>
+      <w:r>
+        <w:t>they</w:t>
+      </w:r>
+      <w:r>
+        <w:t xml:space="preserve"> transform word meaning into computational form. </w:t>
+      </w:r>
+      <w:r>
+        <w:t xml:space="preserve">Similarly to text analysis, LLMs </w:t>
+      </w:r>
+      <w:r>
+        <w:t>take</w:t>
+      </w:r>
+      <w:r>
+        <w:t xml:space="preserve"> a</w:t>
+      </w:r>
+      <w:r>
+        <w:t xml:space="preserve">n individual </w:t>
+      </w:r>
+      <w:r>
+        <w:t>word</w:t>
+      </w:r>
+      <w:r>
+        <w:t>’</w:t>
+      </w:r>
+      <w:r>
+        <w:t xml:space="preserve">s context </w:t>
+      </w:r>
+      <w:r>
+        <w:t>to</w:t>
+      </w:r>
+      <w:r>
+        <w:t xml:space="preserve"> compile word frequencies for </w:t>
+      </w:r>
+      <w:r>
+        <w:t>that</w:t>
+      </w:r>
+      <w:r>
+        <w:t xml:space="preserve"> word. Unlike text analysis, however, these word frequencies are used in </w:t>
+      </w:r>
+      <w:r>
+        <w:rPr>
+          <w:i/>
+          <w:iCs/>
+        </w:rPr>
+        <w:t xml:space="preserve">predictive </w:t>
+      </w:r>
+      <w:r>
+        <w:t xml:space="preserve">processes, as part of algorithms that guess what text </w:t>
+      </w:r>
+      <w:r>
+        <w:t xml:space="preserve">should be </w:t>
+      </w:r>
+      <w:r>
+        <w:t>generate</w:t>
+      </w:r>
+      <w:r>
+        <w:t>d</w:t>
+      </w:r>
+      <w:r>
+        <w:t xml:space="preserve">, that is, which word </w:t>
+      </w:r>
+      <w:r>
+        <w:t>would most likely</w:t>
+      </w:r>
+      <w:r>
+        <w:t xml:space="preserve"> follow </w:t>
+      </w:r>
+      <w:r>
+        <w:t>another word</w:t>
+      </w:r>
+      <w:r>
+        <w:t xml:space="preserve"> based on previous patterns of word usage. In order to </w:t>
+      </w:r>
+      <w:r>
+        <w:t>predict words</w:t>
+      </w:r>
+      <w:r>
+        <w:t xml:space="preserve">, LLMs must create an aggregate representation of word meaning. This representation </w:t>
+      </w:r>
+      <w:r>
+        <w:t xml:space="preserve">contains a kind of </w:t>
+      </w:r>
+      <w:r>
+        <w:t xml:space="preserve">average, or </w:t>
+      </w:r>
+      <w:r>
+        <w:t>approximate</w:t>
+      </w:r>
+      <w:r>
+        <w:t xml:space="preserve">, </w:t>
+      </w:r>
+      <w:r>
+        <w:t>definition</w:t>
+      </w:r>
+      <w:r>
+        <w:t xml:space="preserve"> of the word based on its various usages. </w:t>
+      </w:r>
+      <w:r>
+        <w:t>The chapter argues that t</w:t>
+      </w:r>
+      <w:r>
+        <w:t xml:space="preserve">his </w:t>
+      </w:r>
+      <w:r>
+        <w:t xml:space="preserve">process of </w:t>
+      </w:r>
+      <w:r>
+        <w:t>averag</w:t>
+      </w:r>
+      <w:r>
+        <w:t>ing</w:t>
+      </w:r>
+      <w:r>
+        <w:t xml:space="preserve"> or </w:t>
+      </w:r>
+      <w:r>
+        <w:t>approximating</w:t>
+      </w:r>
+      <w:r>
+        <w:t xml:space="preserve"> word patterns, </w:t>
+      </w:r>
+      <w:r>
+        <w:t xml:space="preserve">which </w:t>
+      </w:r>
+      <w:r>
+        <w:t>aims to</w:t>
+      </w:r>
+      <w:r>
+        <w:t xml:space="preserve"> </w:t>
+      </w:r>
+      <w:r>
+        <w:t>“</w:t>
+      </w:r>
+      <w:r>
+        <w:t>normalize</w:t>
+      </w:r>
+      <w:r>
+        <w:t>”</w:t>
+      </w:r>
+      <w:r>
+        <w:t xml:space="preserve"> </w:t>
+      </w:r>
+      <w:r>
+        <w:t xml:space="preserve">word meaning </w:t>
+      </w:r>
+      <w:r>
+        <w:t>across various examples</w:t>
+      </w:r>
+      <w:r>
+        <w:t xml:space="preserve"> of its usage</w:t>
+      </w:r>
+      <w:r>
+        <w:t xml:space="preserve">, </w:t>
+      </w:r>
+      <w:r>
+        <w:t>lends itself to</w:t>
+      </w:r>
+      <w:r>
+        <w:t xml:space="preserve"> the </w:t>
+      </w:r>
+      <w:r>
+        <w:t>study of</w:t>
+      </w:r>
+      <w:r>
+        <w:t xml:space="preserve"> </w:t>
+      </w:r>
+      <w:r>
+        <w:t xml:space="preserve">social </w:t>
+      </w:r>
+      <w:r>
+        <w:t>norm</w:t>
+      </w:r>
+      <w:r>
+        <w:t xml:space="preserve">s </w:t>
+      </w:r>
+      <w:r>
+        <w:t xml:space="preserve">in language. </w:t>
+      </w:r>
+      <w:proofErr w:type="gramStart"/>
+      <w:r>
+        <w:t xml:space="preserve">It </w:t>
+      </w:r>
+      <w:r>
+        <w:t xml:space="preserve"> </w:t>
+      </w:r>
+      <w:r>
+        <w:t>uses</w:t>
+      </w:r>
+      <w:proofErr w:type="gramEnd"/>
+      <w:r>
+        <w:t xml:space="preserve"> LLMs to study</w:t>
+      </w:r>
+      <w:r>
+        <w:t xml:space="preserve"> these norms in a</w:t>
+      </w:r>
+      <w:r>
+        <w:t xml:space="preserve"> heterosexual, cisgendered context, </w:t>
+      </w:r>
+      <w:r>
+        <w:t>from the</w:t>
+      </w:r>
+      <w:r>
+        <w:t xml:space="preserve"> reality TV show, </w:t>
+      </w:r>
+      <w:r>
+        <w:rPr>
+          <w:rStyle w:val="Emphasis"/>
+        </w:rPr>
+        <w:t>Love is Blind</w:t>
+      </w:r>
+      <w:r>
+        <w:t xml:space="preserve">. </w:t>
+      </w:r>
+      <w:r>
+        <w:t xml:space="preserve">In this show, </w:t>
+      </w:r>
+      <w:r>
+        <w:t xml:space="preserve">heterosexual </w:t>
+      </w:r>
+      <w:r>
+        <w:t xml:space="preserve">participants are placed in a dating experiment </w:t>
+      </w:r>
+      <w:r>
+        <w:t xml:space="preserve">in which they </w:t>
+      </w:r>
+      <w:r>
+        <w:t>cannot</w:t>
+      </w:r>
+      <w:r>
+        <w:t xml:space="preserve"> see their dating partners until they have agreed to marry them. </w:t>
+      </w:r>
+      <w:r>
+        <w:t>Training a</w:t>
+      </w:r>
+      <w:r>
+        <w:t xml:space="preserve">n LLM </w:t>
+      </w:r>
+      <w:r>
+        <w:t xml:space="preserve">on the transcripts from the show, so that it </w:t>
+      </w:r>
+      <w:r>
+        <w:t>generates text that approximates the s</w:t>
+      </w:r>
+      <w:r>
+        <w:t>how participants</w:t>
+      </w:r>
+      <w:r>
+        <w:t>’ speech</w:t>
+      </w:r>
+      <w:r>
+        <w:t xml:space="preserve">, </w:t>
+      </w:r>
+      <w:r>
+        <w:t>the chapter</w:t>
+      </w:r>
+      <w:r>
+        <w:t xml:space="preserve"> pose</w:t>
+      </w:r>
+      <w:r>
+        <w:t>s</w:t>
+      </w:r>
+      <w:r>
+        <w:t xml:space="preserve"> questions about </w:t>
+      </w:r>
+      <w:r>
+        <w:t>the role of gender</w:t>
+      </w:r>
+      <w:r>
+        <w:t xml:space="preserve"> and </w:t>
+      </w:r>
+      <w:r>
+        <w:t xml:space="preserve">embodiment in </w:t>
+      </w:r>
+      <w:r>
+        <w:t xml:space="preserve">the “blind” </w:t>
+      </w:r>
+      <w:r>
+        <w:t>dating dynamic</w:t>
+      </w:r>
+      <w:r>
+        <w:t xml:space="preserve">. The </w:t>
+      </w:r>
+      <w:r>
+        <w:t>LLM’s</w:t>
+      </w:r>
+      <w:r>
+        <w:t xml:space="preserve"> responses reveal linguistic and affective patterns around the body which </w:t>
+      </w:r>
+      <w:r>
+        <w:t>not only characterize the</w:t>
+      </w:r>
+      <w:r>
+        <w:t xml:space="preserve"> normative investments from the show</w:t>
+      </w:r>
+      <w:r>
+        <w:t>, but also an experience of bodily dissonance due to the visual separation between the participants</w:t>
+      </w:r>
+      <w:r>
+        <w:t>.</w:t>
+      </w:r>
+      <w:r>
+        <w:t xml:space="preserve"> To read these experiences, the chapter draws from Trans </w:t>
+      </w:r>
+      <w:r>
+        <w:lastRenderedPageBreak/>
+        <w:t xml:space="preserve">Studies theorizing on the body and the </w:t>
+      </w:r>
+      <w:r>
+        <w:t xml:space="preserve">experience of bodily </w:t>
+      </w:r>
+      <w:r>
+        <w:t>disjunction, which often accompan</w:t>
+      </w:r>
+      <w:r>
+        <w:t>y</w:t>
+      </w:r>
+      <w:r>
+        <w:t xml:space="preserve"> feelings of dysphoria, in transition narratives.</w:t>
+      </w:r>
+      <w:r>
+        <w:t xml:space="preserve"> </w:t>
+      </w:r>
+      <w:r>
+        <w:t>It shows how t</w:t>
+      </w:r>
+      <w:r>
+        <w:t xml:space="preserve">he </w:t>
+      </w:r>
+      <w:r>
+        <w:t xml:space="preserve">participants in </w:t>
+      </w:r>
+      <w:r>
+        <w:rPr>
+          <w:rStyle w:val="Emphasis"/>
+        </w:rPr>
+        <w:t>Love Is Blind</w:t>
+      </w:r>
+      <w:r>
+        <w:t>—</w:t>
+      </w:r>
+      <w:r>
+        <w:t xml:space="preserve">while firmly anchored </w:t>
+      </w:r>
+      <w:r>
+        <w:t>to their</w:t>
+      </w:r>
+      <w:r>
+        <w:t xml:space="preserve"> cisnormative frameworks</w:t>
+      </w:r>
+      <w:r>
+        <w:t>—</w:t>
+      </w:r>
+      <w:r>
+        <w:t xml:space="preserve">experience a temporary form of </w:t>
+      </w:r>
+      <w:r>
+        <w:t xml:space="preserve">sensory disjunction that evokes </w:t>
+      </w:r>
+      <w:r>
+        <w:t xml:space="preserve">experiences from </w:t>
+      </w:r>
+      <w:r>
+        <w:t>trans narratives</w:t>
+      </w:r>
+      <w:r>
+        <w:t>. The chapter concludes that this analysis, which based on surfacing shared investments</w:t>
+      </w:r>
+      <w:r>
+        <w:t xml:space="preserve"> between identity groups</w:t>
+      </w:r>
+      <w:r>
+        <w:t>,</w:t>
+      </w:r>
+      <w:r>
+        <w:t xml:space="preserve"> offers ground</w:t>
+      </w:r>
+      <w:r>
+        <w:t>work</w:t>
+      </w:r>
+      <w:r>
+        <w:t xml:space="preserve"> for building solidarity across </w:t>
+      </w:r>
+      <w:r>
+        <w:t xml:space="preserve">even polarized </w:t>
+      </w:r>
+      <w:r>
+        <w:t>points of view.</w:t>
+      </w:r>
+    </w:p>
+    <w:p>
+      <w:pPr>
+        <w:pStyle w:val="Textbody"/>
+        <w:spacing w:line="480" w:lineRule="auto"/>
+        <w:ind w:firstLine="709"/>
+      </w:pPr>
+      <w:r>
+        <w:t xml:space="preserve">Thinking about resistance against oppressive systems, the conclusion explores what it means to </w:t>
+      </w:r>
+      <w:r>
+        <w:t>take</w:t>
+      </w:r>
+      <w:r>
+        <w:t xml:space="preserve"> what are reductive technological tools </w:t>
+      </w:r>
+      <w:r>
+        <w:t>and appropriate them toward</w:t>
+      </w:r>
+      <w:r>
+        <w:t xml:space="preserve"> the work of resistance. </w:t>
+      </w:r>
+      <w:r>
+        <w:t xml:space="preserve">It begins with a meditation on </w:t>
+      </w:r>
+      <w:r>
+        <w:t xml:space="preserve">Judith Butler’s recent </w:t>
+      </w:r>
+      <w:r>
+        <w:t>comments on “passion”</w:t>
+      </w:r>
+      <w:r>
+        <w:t xml:space="preserve"> as a potential tool of resistance. Butler</w:t>
+      </w:r>
+      <w:r>
+        <w:t xml:space="preserve"> </w:t>
+      </w:r>
+      <w:r>
+        <w:t xml:space="preserve">explains how </w:t>
+      </w:r>
+      <w:r>
+        <w:t>passion</w:t>
+      </w:r>
+      <w:r>
+        <w:t xml:space="preserve"> </w:t>
+      </w:r>
+      <w:r>
+        <w:t>has been instrumentalized by the far right in</w:t>
+      </w:r>
+      <w:r>
+        <w:t xml:space="preserve"> </w:t>
+      </w:r>
+      <w:r>
+        <w:t xml:space="preserve">violent </w:t>
+      </w:r>
+      <w:r>
+        <w:t xml:space="preserve">racist and transphobic </w:t>
+      </w:r>
+      <w:r>
+        <w:t xml:space="preserve">rights </w:t>
+      </w:r>
+      <w:r>
+        <w:t>violations, such as those by Immigration and Customs Enforcement (ICE) in the United States</w:t>
+      </w:r>
+      <w:r>
+        <w:t>. These passions, Butler explains, “</w:t>
+      </w:r>
+      <w:r>
+        <w:t>release or incite sudden and shameless outbreaks of sadistic exhilaration in those they are meant to thrill and recruit, to recruit to that thrill</w:t>
+      </w:r>
+      <w:r>
+        <w:t>” (</w:t>
+      </w:r>
+      <w:r>
+        <w:rPr>
+          <w:i/>
+          <w:iCs/>
+        </w:rPr>
+        <w:t xml:space="preserve">The </w:t>
+      </w:r>
+      <w:r>
+        <w:rPr>
+          <w:i/>
+          <w:iCs/>
+        </w:rPr>
+        <w:t>Scholar and Feminist 2026 Conference</w:t>
+      </w:r>
+      <w:r>
+        <w:t>). Butler wonders how the notion of “</w:t>
+      </w:r>
+      <w:r>
+        <w:t>thrill</w:t>
+      </w:r>
+      <w:r>
+        <w:t>” might “</w:t>
+      </w:r>
+      <w:r>
+        <w:t>recruit</w:t>
+      </w:r>
+      <w:r>
+        <w:t>”</w:t>
+      </w:r>
+      <w:r>
+        <w:rPr>
+          <w:i/>
+          <w:iCs/>
+        </w:rPr>
+        <w:t xml:space="preserve"> </w:t>
+      </w:r>
+      <w:r>
+        <w:t>a counter-movement, one that “</w:t>
+      </w:r>
+      <w:r>
+        <w:t>mobiliz</w:t>
+      </w:r>
+      <w:r>
+        <w:t xml:space="preserve">[es] </w:t>
+      </w:r>
+      <w:r>
+        <w:t>appeals to passions for freedom, equality, and justice.”</w:t>
+      </w:r>
+      <w:r>
+        <w:t xml:space="preserve"> Butler’s prosposal here echoes her fundamental operation in queer theory, which was present from her landmark theory of performativity: of taking a mechanism that has been used to oppress, and twisting it toward other uses. The conclusion explores recent work to this end, drawing from examples of tech resistance movements from </w:t>
+      </w:r>
+      <w:r>
+        <w:t>the Global South</w:t>
+      </w:r>
+      <w:r>
+        <w:t xml:space="preserve">, </w:t>
+      </w:r>
+      <w:r>
+        <w:t xml:space="preserve">from indigenous and marginalized </w:t>
+      </w:r>
+      <w:r>
+        <w:t xml:space="preserve">communities in </w:t>
+      </w:r>
+      <w:r>
+        <w:t xml:space="preserve">New Zealand, South Africa, and Brazil, where activists and workers are taking the tools of AI industry and using them to push against commercializing </w:t>
+      </w:r>
+      <w:r>
+        <w:t xml:space="preserve">and extractivist </w:t>
+      </w:r>
+      <w:r>
+        <w:t xml:space="preserve">logics. These movements represent the work of </w:t>
+      </w:r>
+      <w:r>
+        <w:rPr>
+          <w:i/>
+          <w:iCs/>
+        </w:rPr>
+        <w:t>Counter-Code</w:t>
+      </w:r>
+      <w:r>
+        <w:t xml:space="preserve"> in an everyday register of activism.  </w:t>
+      </w:r>
+    </w:p>
+    <w:p>
+      <w:pPr>
+        <w:pStyle w:val="Textbody"/>
+        <w:spacing w:line="480" w:lineRule="auto"/>
+        <w:ind w:firstLine="709"/>
+      </w:pPr>
+      <w:r>
+        <w:t xml:space="preserve">As of </w:t>
+      </w:r>
+      <w:r>
+        <w:t>March 2026</w:t>
+      </w:r>
+      <w:r>
+        <w:t xml:space="preserve">, four </w:t>
+      </w:r>
+      <w:r>
+        <w:t xml:space="preserve">of the five </w:t>
+      </w:r>
+      <w:r>
+        <w:t xml:space="preserve">body chapters have been drafted, </w:t>
+      </w:r>
+      <w:r>
+        <w:t xml:space="preserve">with two of these still in need of </w:t>
+      </w:r>
+      <w:r>
+        <w:t xml:space="preserve">revision. The </w:t>
+      </w:r>
+      <w:r>
+        <w:t xml:space="preserve">final chapter, </w:t>
+      </w:r>
+      <w:r>
+        <w:t>introduction</w:t>
+      </w:r>
+      <w:r>
+        <w:t>,</w:t>
+      </w:r>
+      <w:r>
+        <w:t xml:space="preserve"> and the conclusion remain to be drafted. </w:t>
+      </w:r>
+    </w:p>
+    <w:p>
+      <w:pPr>
+        <w:pStyle w:val="Textbody"/>
+        <w:spacing w:line="480" w:lineRule="auto"/>
+        <w:ind w:firstLine="709"/>
         <w:rPr>
           <w:rFonts w:cs="Times New Roman"/>
         </w:rPr>
@@ -3368,7 +4471,14 @@
         <w:rPr>
           <w:rFonts w:cs="Times New Roman"/>
         </w:rPr>
-        <w:t>is a self-taught programmer who uses digital tools to study queerness. Trained in English Literature</w:t>
+        <w:t xml:space="preserve">is a self-taught programmer who uses digital tools to study </w:t>
+      </w:r>
+      <w:r>
+        <w:rPr>
+          <w:rFonts w:cs="Times New Roman"/>
+        </w:rPr>
+        <w:lastRenderedPageBreak/>
+        <w:t>queerness. Trained in English Literature</w:t>
       </w:r>
       <w:r>
         <w:rPr>
@@ -3380,21 +4490,7 @@
         <w:rPr>
           <w:rFonts w:cs="Times New Roman"/>
         </w:rPr>
-        <w:t xml:space="preserve">he Graduate </w:t>
-      </w:r>
-      <w:proofErr w:type="spellStart"/>
-      <w:r>
-        <w:rPr>
-          <w:rFonts w:cs="Times New Roman"/>
-        </w:rPr>
-        <w:t>Center</w:t>
-      </w:r>
-      <w:proofErr w:type="spellEnd"/>
-      <w:r>
-        <w:rPr>
-          <w:rFonts w:cs="Times New Roman"/>
-        </w:rPr>
-        <w:t>, CUNY</w:t>
+        <w:t>he Graduate Center, CUNY</w:t>
       </w:r>
       <w:r>
         <w:rPr>
@@ -3541,23 +4637,13 @@
         </w:rPr>
         <w:t xml:space="preserve"> </w:t>
       </w:r>
-      <w:proofErr w:type="spellStart"/>
       <w:r>
         <w:rPr>
           <w:rFonts w:cs="Times New Roman"/>
           <w:i/>
           <w:iCs/>
         </w:rPr>
-        <w:t>GeBNLP</w:t>
-      </w:r>
-      <w:proofErr w:type="spellEnd"/>
-      <w:r>
-        <w:rPr>
-          <w:rFonts w:cs="Times New Roman"/>
-          <w:i/>
-          <w:iCs/>
-        </w:rPr>
-        <w:t>: The 6th Workshop on Gender Bias in Natural Language Processing</w:t>
+        <w:t>GeBNLP: The 6th Workshop on Gender Bias in Natural Language Processing</w:t>
       </w:r>
       <w:r>
         <w:rPr>
@@ -3587,35 +4673,7 @@
         <w:rPr>
           <w:rFonts w:cs="Times New Roman"/>
         </w:rPr>
-        <w:t xml:space="preserve">under open licenses, are available on </w:t>
-      </w:r>
-      <w:proofErr w:type="spellStart"/>
-      <w:r>
-        <w:rPr>
-          <w:rFonts w:cs="Times New Roman"/>
-        </w:rPr>
-        <w:t>Github</w:t>
-      </w:r>
-      <w:proofErr w:type="spellEnd"/>
-      <w:r>
-        <w:rPr>
-          <w:rFonts w:cs="Times New Roman"/>
-        </w:rPr>
-        <w:t xml:space="preserve"> and </w:t>
-      </w:r>
-      <w:proofErr w:type="spellStart"/>
-      <w:r>
-        <w:rPr>
-          <w:rFonts w:cs="Times New Roman"/>
-        </w:rPr>
-        <w:t>Huggingface</w:t>
-      </w:r>
-      <w:proofErr w:type="spellEnd"/>
-      <w:r>
-        <w:rPr>
-          <w:rFonts w:cs="Times New Roman"/>
-        </w:rPr>
-        <w:t xml:space="preserve"> (See </w:t>
+        <w:t xml:space="preserve">under open licenses, are available on Github and Huggingface (See </w:t>
       </w:r>
       <w:r>
         <w:rPr>
@@ -3627,14 +4685,7 @@
         <w:rPr>
           <w:rFonts w:cs="Times New Roman"/>
         </w:rPr>
-        <w:t xml:space="preserve">Calado, </w:t>
-      </w:r>
-      <w:r>
-        <w:rPr>
-          <w:rFonts w:cs="Times New Roman"/>
-        </w:rPr>
-        <w:lastRenderedPageBreak/>
-        <w:t>Filipa</w:t>
+        <w:t>Calado, Filipa</w:t>
       </w:r>
       <w:r>
         <w:rPr>
@@ -3782,7 +4833,6 @@
         <w:spacing w:line="480" w:lineRule="auto"/>
       </w:pPr>
       <w:r>
-        <w:lastRenderedPageBreak/>
         <w:t xml:space="preserve">Butler, Judith. </w:t>
       </w:r>
       <w:r>
@@ -3855,15 +4905,7 @@
         <w:t>Gofilipa</w:t>
       </w:r>
       <w:r>
-        <w:t xml:space="preserve">. </w:t>
-      </w:r>
-      <w:proofErr w:type="spellStart"/>
-      <w:r>
-        <w:t>Github</w:t>
-      </w:r>
-      <w:proofErr w:type="spellEnd"/>
-      <w:r>
-        <w:t xml:space="preserve">.  </w:t>
+        <w:t xml:space="preserve">. Github.  </w:t>
       </w:r>
     </w:p>
     <w:p>
@@ -3887,7 +4929,6 @@
       <w:r>
         <w:t xml:space="preserve">Calado, Filipa. </w:t>
       </w:r>
-      <w:proofErr w:type="spellStart"/>
       <w:r>
         <w:rPr>
           <w:i/>
@@ -3895,7 +4936,6 @@
         </w:rPr>
         <w:t>love_blind</w:t>
       </w:r>
-      <w:proofErr w:type="spellEnd"/>
       <w:r>
         <w:rPr>
           <w:i/>
@@ -3914,15 +4954,7 @@
         <w:t>Gofilipa</w:t>
       </w:r>
       <w:r>
-        <w:t xml:space="preserve">. </w:t>
-      </w:r>
-      <w:proofErr w:type="spellStart"/>
-      <w:r>
-        <w:t>Github</w:t>
-      </w:r>
-      <w:proofErr w:type="spellEnd"/>
-      <w:r>
-        <w:t xml:space="preserve">. </w:t>
+        <w:t xml:space="preserve">. Github. </w:t>
       </w:r>
     </w:p>
     <w:p>
@@ -3966,21 +4998,12 @@
       <w:r>
         <w:t xml:space="preserve">, </w:t>
       </w:r>
-      <w:proofErr w:type="spellStart"/>
       <w:r>
         <w:rPr>
           <w:i/>
           <w:iCs/>
         </w:rPr>
-        <w:t>LoveIsBlind_Pods</w:t>
-      </w:r>
-      <w:proofErr w:type="spellEnd"/>
-      <w:r>
-        <w:rPr>
-          <w:i/>
-          <w:iCs/>
-        </w:rPr>
-        <w:t>,</w:t>
+        <w:t>LoveIsBlind_Pods,</w:t>
       </w:r>
       <w:r>
         <w:t xml:space="preserve"> </w:t>
@@ -3995,7 +5018,6 @@
           <w:rFonts w:cs="Times New Roman"/>
         </w:rPr>
       </w:pPr>
-      <w:proofErr w:type="spellStart"/>
       <w:r>
         <w:rPr>
           <w:i/>
@@ -4003,17 +5025,8 @@
         </w:rPr>
         <w:t>LoveIsBlind_Postpods</w:t>
       </w:r>
-      <w:proofErr w:type="spellEnd"/>
-      <w:r>
-        <w:t xml:space="preserve">, Large Language Model repositories. </w:t>
-      </w:r>
-      <w:proofErr w:type="spellStart"/>
-      <w:r>
-        <w:t>Huggingface</w:t>
-      </w:r>
-      <w:proofErr w:type="spellEnd"/>
-      <w:r>
-        <w:t xml:space="preserve">. </w:t>
+      <w:r>
+        <w:t xml:space="preserve">, Large Language Model repositories. Huggingface. </w:t>
       </w:r>
       <w:r>
         <w:t>https://huggingface.co/gofilipa/</w:t>
@@ -4097,38 +5110,23 @@
           <w:i/>
           <w:iCs/>
         </w:rPr>
-        <w:t xml:space="preserve">Media Studies and Digital Humanities / Edited by </w:t>
-      </w:r>
-      <w:proofErr w:type="spellStart"/>
-      <w:r>
+        <w:t>Media Studies and Digital Humanities / Edited by Jentery Sayers</w:t>
+      </w:r>
+      <w:r>
+        <w:t>. Routledge, Taylor &amp; Francis Group, 2018</w:t>
+      </w:r>
+    </w:p>
+    <w:p>
+      <w:pPr>
+        <w:pStyle w:val="Textbody"/>
+        <w:spacing w:after="0" w:line="480" w:lineRule="auto"/>
         <w:rPr>
           <w:i/>
           <w:iCs/>
         </w:rPr>
-        <w:t>Jentery</w:t>
-      </w:r>
-      <w:proofErr w:type="spellEnd"/>
-      <w:r>
-        <w:rPr>
-          <w:i/>
-          <w:iCs/>
-        </w:rPr>
-        <w:t xml:space="preserve"> Sayers</w:t>
-      </w:r>
-      <w:r>
-        <w:t>. Routledge, Taylor &amp; Francis Group, 2018</w:t>
-      </w:r>
-    </w:p>
-    <w:p>
-      <w:pPr>
-        <w:pStyle w:val="Textbody"/>
-        <w:spacing w:after="0" w:line="480" w:lineRule="auto"/>
-        <w:rPr>
-          <w:i/>
-          <w:iCs/>
-        </w:rPr>
-      </w:pPr>
-      <w:r>
+      </w:pPr>
+      <w:r>
+        <w:lastRenderedPageBreak/>
         <w:t xml:space="preserve">Gaboury, Jacob. </w:t>
       </w:r>
       <w:r>
@@ -4259,23 +5257,7 @@
           <w:i/>
           <w:iCs/>
         </w:rPr>
-        <w:t xml:space="preserve"> Queers of </w:t>
-      </w:r>
-      <w:proofErr w:type="spellStart"/>
-      <w:r>
-        <w:rPr>
-          <w:i/>
-          <w:iCs/>
-        </w:rPr>
-        <w:t>Color</w:t>
-      </w:r>
-      <w:proofErr w:type="spellEnd"/>
-      <w:r>
-        <w:rPr>
-          <w:i/>
-          <w:iCs/>
-        </w:rPr>
-        <w:t xml:space="preserve"> and the Performance of Politics / José </w:t>
+        <w:t xml:space="preserve"> Queers of Color and the Performance of Politics / José </w:t>
       </w:r>
     </w:p>
     <w:p>

</xml_diff>